<commit_message>
Add text post processing to adhere to german specific grammar rules
</commit_message>
<xml_diff>
--- a/Documentation/User_Manual_ForensicWhisperDeskZH.docx
+++ b/Documentation/User_Manual_ForensicWhisperDeskZH.docx
@@ -1041,18 +1041,20 @@
           <w:tab w:val="right" w:leader="underscore" w:pos="9016"/>
         </w:tabs>
         <w:rPr>
-          <w:rFonts w:eastAsiaTheme="minorEastAsia"/>
+          <w:rFonts w:asciiTheme="minorHAnsi" w:eastAsiaTheme="minorEastAsia" w:hAnsiTheme="minorHAnsi"/>
           <w:b w:val="0"/>
           <w:bCs w:val="0"/>
           <w:noProof/>
-          <w:sz w:val="24"/>
-          <w:szCs w:val="24"/>
+          <w:sz w:val="28"/>
+          <w:szCs w:val="28"/>
           <w:lang w:val="en-CH" w:eastAsia="en-CH"/>
         </w:rPr>
       </w:pPr>
       <w:r>
         <w:rPr>
           <w:rFonts w:cs="Times New Roman"/>
+          <w:sz w:val="28"/>
+          <w:szCs w:val="28"/>
         </w:rPr>
         <w:lastRenderedPageBreak/>
         <w:fldChar w:fldCharType="begin"/>
@@ -1060,53 +1062,65 @@
       <w:r>
         <w:rPr>
           <w:rFonts w:cs="Times New Roman"/>
+          <w:sz w:val="28"/>
+          <w:szCs w:val="28"/>
         </w:rPr>
         <w:instrText xml:space="preserve"> TOC \h \z \t "Heading 1,2,Heading 2,3,Heading 3,4,Header,1" </w:instrText>
       </w:r>
       <w:r>
         <w:rPr>
           <w:rFonts w:cs="Times New Roman"/>
+          <w:sz w:val="28"/>
+          <w:szCs w:val="28"/>
         </w:rPr>
         <w:fldChar w:fldCharType="separate"/>
       </w:r>
-      <w:hyperlink w:anchor="_Toc209175198" w:history="1">
+      <w:hyperlink w:anchor="_Toc209624206" w:history="1">
         <w:r>
           <w:rPr>
             <w:rStyle w:val="Hyperlink"/>
             <w:noProof/>
+            <w:sz w:val="24"/>
+            <w:szCs w:val="24"/>
           </w:rPr>
           <w:t>1.</w:t>
         </w:r>
         <w:r>
           <w:rPr>
-            <w:rFonts w:eastAsiaTheme="minorEastAsia"/>
+            <w:rFonts w:asciiTheme="minorHAnsi" w:eastAsiaTheme="minorEastAsia" w:hAnsiTheme="minorHAnsi"/>
             <w:b w:val="0"/>
             <w:bCs w:val="0"/>
             <w:noProof/>
+            <w:sz w:val="28"/>
+            <w:szCs w:val="28"/>
+            <w:lang w:val="en-CH" w:eastAsia="en-CH"/>
+          </w:rPr>
+          <w:tab/>
+        </w:r>
+        <w:r>
+          <w:rPr>
+            <w:rStyle w:val="Hyperlink"/>
+            <w:noProof/>
             <w:sz w:val="24"/>
             <w:szCs w:val="24"/>
-            <w:lang w:val="en-CH" w:eastAsia="en-CH"/>
+          </w:rPr>
+          <w:t>Übersicht</w:t>
+        </w:r>
+        <w:r>
+          <w:rPr>
+            <w:noProof/>
+            <w:webHidden/>
+            <w:sz w:val="24"/>
+            <w:szCs w:val="24"/>
           </w:rPr>
           <w:tab/>
         </w:r>
         <w:r>
           <w:rPr>
-            <w:rStyle w:val="Hyperlink"/>
-            <w:noProof/>
-          </w:rPr>
-          <w:t>Übersicht</w:t>
-        </w:r>
-        <w:r>
-          <w:rPr>
-            <w:noProof/>
-            <w:webHidden/>
-          </w:rPr>
-          <w:tab/>
-        </w:r>
-        <w:r>
-          <w:rPr>
-            <w:noProof/>
-            <w:webHidden/>
+            <w:noProof/>
+            <w:webHidden/>
+            <w:sz w:val="24"/>
+            <w:szCs w:val="24"/>
           </w:rPr>
           <w:fldChar w:fldCharType="begin"/>
         </w:r>
@@ -1114,19 +1128,25 @@
           <w:rPr>
             <w:noProof/>
             <w:webHidden/>
-          </w:rPr>
-          <w:instrText xml:space="preserve"> PAGEREF _Toc209175198 \h </w:instrText>
-        </w:r>
-        <w:r>
-          <w:rPr>
-            <w:noProof/>
-            <w:webHidden/>
-          </w:rPr>
-        </w:r>
-        <w:r>
-          <w:rPr>
-            <w:noProof/>
-            <w:webHidden/>
+            <w:sz w:val="24"/>
+            <w:szCs w:val="24"/>
+          </w:rPr>
+          <w:instrText xml:space="preserve"> PAGEREF _Toc209624206 \h </w:instrText>
+        </w:r>
+        <w:r>
+          <w:rPr>
+            <w:noProof/>
+            <w:webHidden/>
+            <w:sz w:val="24"/>
+            <w:szCs w:val="24"/>
+          </w:rPr>
+        </w:r>
+        <w:r>
+          <w:rPr>
+            <w:noProof/>
+            <w:webHidden/>
+            <w:sz w:val="24"/>
+            <w:szCs w:val="24"/>
           </w:rPr>
           <w:fldChar w:fldCharType="separate"/>
         </w:r>
@@ -1134,6 +1154,8 @@
           <w:rPr>
             <w:noProof/>
             <w:webHidden/>
+            <w:sz w:val="24"/>
+            <w:szCs w:val="24"/>
           </w:rPr>
           <w:t>3</w:t>
         </w:r>
@@ -1141,6 +1163,8 @@
           <w:rPr>
             <w:noProof/>
             <w:webHidden/>
+            <w:sz w:val="24"/>
+            <w:szCs w:val="24"/>
           </w:rPr>
           <w:fldChar w:fldCharType="end"/>
         </w:r>
@@ -1153,18 +1177,20 @@
           <w:tab w:val="right" w:leader="underscore" w:pos="9016"/>
         </w:tabs>
         <w:rPr>
-          <w:rFonts w:eastAsiaTheme="minorEastAsia"/>
+          <w:rFonts w:asciiTheme="minorHAnsi" w:eastAsiaTheme="minorEastAsia" w:hAnsiTheme="minorHAnsi"/>
           <w:noProof/>
-          <w:sz w:val="24"/>
-          <w:szCs w:val="24"/>
+          <w:sz w:val="28"/>
+          <w:szCs w:val="28"/>
           <w:lang w:val="en-CH" w:eastAsia="en-CH"/>
         </w:rPr>
       </w:pPr>
-      <w:hyperlink w:anchor="_Toc209175199" w:history="1">
+      <w:hyperlink w:anchor="_Toc209624207" w:history="1">
         <w:r>
           <w:rPr>
             <w:rStyle w:val="Hyperlink"/>
             <w:noProof/>
+            <w:sz w:val="22"/>
+            <w:szCs w:val="22"/>
           </w:rPr>
           <w:t>Wichtigste Merkmale:</w:t>
         </w:r>
@@ -1172,6 +1198,8 @@
           <w:rPr>
             <w:noProof/>
             <w:webHidden/>
+            <w:sz w:val="22"/>
+            <w:szCs w:val="22"/>
           </w:rPr>
           <w:tab/>
         </w:r>
@@ -1179,6 +1207,8 @@
           <w:rPr>
             <w:noProof/>
             <w:webHidden/>
+            <w:sz w:val="22"/>
+            <w:szCs w:val="22"/>
           </w:rPr>
           <w:fldChar w:fldCharType="begin"/>
         </w:r>
@@ -1186,19 +1216,25 @@
           <w:rPr>
             <w:noProof/>
             <w:webHidden/>
-          </w:rPr>
-          <w:instrText xml:space="preserve"> PAGEREF _Toc209175199 \h </w:instrText>
-        </w:r>
-        <w:r>
-          <w:rPr>
-            <w:noProof/>
-            <w:webHidden/>
-          </w:rPr>
-        </w:r>
-        <w:r>
-          <w:rPr>
-            <w:noProof/>
-            <w:webHidden/>
+            <w:sz w:val="22"/>
+            <w:szCs w:val="22"/>
+          </w:rPr>
+          <w:instrText xml:space="preserve"> PAGEREF _Toc209624207 \h </w:instrText>
+        </w:r>
+        <w:r>
+          <w:rPr>
+            <w:noProof/>
+            <w:webHidden/>
+            <w:sz w:val="22"/>
+            <w:szCs w:val="22"/>
+          </w:rPr>
+        </w:r>
+        <w:r>
+          <w:rPr>
+            <w:noProof/>
+            <w:webHidden/>
+            <w:sz w:val="22"/>
+            <w:szCs w:val="22"/>
           </w:rPr>
           <w:fldChar w:fldCharType="separate"/>
         </w:r>
@@ -1206,6 +1242,8 @@
           <w:rPr>
             <w:noProof/>
             <w:webHidden/>
+            <w:sz w:val="22"/>
+            <w:szCs w:val="22"/>
           </w:rPr>
           <w:t>3</w:t>
         </w:r>
@@ -1213,6 +1251,8 @@
           <w:rPr>
             <w:noProof/>
             <w:webHidden/>
+            <w:sz w:val="22"/>
+            <w:szCs w:val="22"/>
           </w:rPr>
           <w:fldChar w:fldCharType="end"/>
         </w:r>
@@ -1225,18 +1265,20 @@
           <w:tab w:val="right" w:leader="underscore" w:pos="9016"/>
         </w:tabs>
         <w:rPr>
-          <w:rFonts w:eastAsiaTheme="minorEastAsia"/>
+          <w:rFonts w:asciiTheme="minorHAnsi" w:eastAsiaTheme="minorEastAsia" w:hAnsiTheme="minorHAnsi"/>
           <w:noProof/>
-          <w:sz w:val="24"/>
-          <w:szCs w:val="24"/>
+          <w:sz w:val="28"/>
+          <w:szCs w:val="28"/>
           <w:lang w:val="en-CH" w:eastAsia="en-CH"/>
         </w:rPr>
       </w:pPr>
-      <w:hyperlink w:anchor="_Toc209175200" w:history="1">
+      <w:hyperlink w:anchor="_Toc209624208" w:history="1">
         <w:r>
           <w:rPr>
             <w:rStyle w:val="Hyperlink"/>
             <w:noProof/>
+            <w:sz w:val="22"/>
+            <w:szCs w:val="22"/>
           </w:rPr>
           <w:t>Voraussetzungen</w:t>
         </w:r>
@@ -1244,6 +1286,8 @@
           <w:rPr>
             <w:noProof/>
             <w:webHidden/>
+            <w:sz w:val="22"/>
+            <w:szCs w:val="22"/>
           </w:rPr>
           <w:tab/>
         </w:r>
@@ -1251,6 +1295,8 @@
           <w:rPr>
             <w:noProof/>
             <w:webHidden/>
+            <w:sz w:val="22"/>
+            <w:szCs w:val="22"/>
           </w:rPr>
           <w:fldChar w:fldCharType="begin"/>
         </w:r>
@@ -1258,19 +1304,25 @@
           <w:rPr>
             <w:noProof/>
             <w:webHidden/>
-          </w:rPr>
-          <w:instrText xml:space="preserve"> PAGEREF _Toc209175200 \h </w:instrText>
-        </w:r>
-        <w:r>
-          <w:rPr>
-            <w:noProof/>
-            <w:webHidden/>
-          </w:rPr>
-        </w:r>
-        <w:r>
-          <w:rPr>
-            <w:noProof/>
-            <w:webHidden/>
+            <w:sz w:val="22"/>
+            <w:szCs w:val="22"/>
+          </w:rPr>
+          <w:instrText xml:space="preserve"> PAGEREF _Toc209624208 \h </w:instrText>
+        </w:r>
+        <w:r>
+          <w:rPr>
+            <w:noProof/>
+            <w:webHidden/>
+            <w:sz w:val="22"/>
+            <w:szCs w:val="22"/>
+          </w:rPr>
+        </w:r>
+        <w:r>
+          <w:rPr>
+            <w:noProof/>
+            <w:webHidden/>
+            <w:sz w:val="22"/>
+            <w:szCs w:val="22"/>
           </w:rPr>
           <w:fldChar w:fldCharType="separate"/>
         </w:r>
@@ -1278,6 +1330,8 @@
           <w:rPr>
             <w:noProof/>
             <w:webHidden/>
+            <w:sz w:val="22"/>
+            <w:szCs w:val="22"/>
           </w:rPr>
           <w:t>3</w:t>
         </w:r>
@@ -1285,6 +1339,8 @@
           <w:rPr>
             <w:noProof/>
             <w:webHidden/>
+            <w:sz w:val="22"/>
+            <w:szCs w:val="22"/>
           </w:rPr>
           <w:fldChar w:fldCharType="end"/>
         </w:r>
@@ -1297,18 +1353,20 @@
           <w:tab w:val="right" w:leader="underscore" w:pos="9016"/>
         </w:tabs>
         <w:rPr>
-          <w:rFonts w:eastAsiaTheme="minorEastAsia"/>
+          <w:rFonts w:asciiTheme="minorHAnsi" w:eastAsiaTheme="minorEastAsia" w:hAnsiTheme="minorHAnsi"/>
           <w:noProof/>
-          <w:sz w:val="24"/>
-          <w:szCs w:val="24"/>
+          <w:sz w:val="28"/>
+          <w:szCs w:val="28"/>
           <w:lang w:val="en-CH" w:eastAsia="en-CH"/>
         </w:rPr>
       </w:pPr>
-      <w:hyperlink w:anchor="_Toc209175201" w:history="1">
+      <w:hyperlink w:anchor="_Toc209624209" w:history="1">
         <w:r>
           <w:rPr>
             <w:rStyle w:val="Hyperlink"/>
             <w:noProof/>
+            <w:sz w:val="22"/>
+            <w:szCs w:val="22"/>
           </w:rPr>
           <w:t>Minimale Systemanforderungen</w:t>
         </w:r>
@@ -1316,6 +1374,8 @@
           <w:rPr>
             <w:noProof/>
             <w:webHidden/>
+            <w:sz w:val="22"/>
+            <w:szCs w:val="22"/>
           </w:rPr>
           <w:tab/>
         </w:r>
@@ -1323,6 +1383,8 @@
           <w:rPr>
             <w:noProof/>
             <w:webHidden/>
+            <w:sz w:val="22"/>
+            <w:szCs w:val="22"/>
           </w:rPr>
           <w:fldChar w:fldCharType="begin"/>
         </w:r>
@@ -1330,19 +1392,25 @@
           <w:rPr>
             <w:noProof/>
             <w:webHidden/>
-          </w:rPr>
-          <w:instrText xml:space="preserve"> PAGEREF _Toc209175201 \h </w:instrText>
-        </w:r>
-        <w:r>
-          <w:rPr>
-            <w:noProof/>
-            <w:webHidden/>
-          </w:rPr>
-        </w:r>
-        <w:r>
-          <w:rPr>
-            <w:noProof/>
-            <w:webHidden/>
+            <w:sz w:val="22"/>
+            <w:szCs w:val="22"/>
+          </w:rPr>
+          <w:instrText xml:space="preserve"> PAGEREF _Toc209624209 \h </w:instrText>
+        </w:r>
+        <w:r>
+          <w:rPr>
+            <w:noProof/>
+            <w:webHidden/>
+            <w:sz w:val="22"/>
+            <w:szCs w:val="22"/>
+          </w:rPr>
+        </w:r>
+        <w:r>
+          <w:rPr>
+            <w:noProof/>
+            <w:webHidden/>
+            <w:sz w:val="22"/>
+            <w:szCs w:val="22"/>
           </w:rPr>
           <w:fldChar w:fldCharType="separate"/>
         </w:r>
@@ -1350,6 +1418,8 @@
           <w:rPr>
             <w:noProof/>
             <w:webHidden/>
+            <w:sz w:val="22"/>
+            <w:szCs w:val="22"/>
           </w:rPr>
           <w:t>3</w:t>
         </w:r>
@@ -1357,6 +1427,8 @@
           <w:rPr>
             <w:noProof/>
             <w:webHidden/>
+            <w:sz w:val="22"/>
+            <w:szCs w:val="22"/>
           </w:rPr>
           <w:fldChar w:fldCharType="end"/>
         </w:r>
@@ -1369,18 +1441,20 @@
           <w:tab w:val="right" w:leader="underscore" w:pos="9016"/>
         </w:tabs>
         <w:rPr>
-          <w:rFonts w:eastAsiaTheme="minorEastAsia"/>
+          <w:rFonts w:asciiTheme="minorHAnsi" w:eastAsiaTheme="minorEastAsia" w:hAnsiTheme="minorHAnsi"/>
           <w:noProof/>
-          <w:sz w:val="24"/>
-          <w:szCs w:val="24"/>
+          <w:sz w:val="28"/>
+          <w:szCs w:val="28"/>
           <w:lang w:val="en-CH" w:eastAsia="en-CH"/>
         </w:rPr>
       </w:pPr>
-      <w:hyperlink w:anchor="_Toc209175202" w:history="1">
+      <w:hyperlink w:anchor="_Toc209624210" w:history="1">
         <w:r>
           <w:rPr>
             <w:rStyle w:val="Hyperlink"/>
             <w:noProof/>
+            <w:sz w:val="22"/>
+            <w:szCs w:val="22"/>
           </w:rPr>
           <w:t>Empfohlene Systemanforderungen</w:t>
         </w:r>
@@ -1388,6 +1462,8 @@
           <w:rPr>
             <w:noProof/>
             <w:webHidden/>
+            <w:sz w:val="22"/>
+            <w:szCs w:val="22"/>
           </w:rPr>
           <w:tab/>
         </w:r>
@@ -1395,6 +1471,8 @@
           <w:rPr>
             <w:noProof/>
             <w:webHidden/>
+            <w:sz w:val="22"/>
+            <w:szCs w:val="22"/>
           </w:rPr>
           <w:fldChar w:fldCharType="begin"/>
         </w:r>
@@ -1402,19 +1480,25 @@
           <w:rPr>
             <w:noProof/>
             <w:webHidden/>
-          </w:rPr>
-          <w:instrText xml:space="preserve"> PAGEREF _Toc209175202 \h </w:instrText>
-        </w:r>
-        <w:r>
-          <w:rPr>
-            <w:noProof/>
-            <w:webHidden/>
-          </w:rPr>
-        </w:r>
-        <w:r>
-          <w:rPr>
-            <w:noProof/>
-            <w:webHidden/>
+            <w:sz w:val="22"/>
+            <w:szCs w:val="22"/>
+          </w:rPr>
+          <w:instrText xml:space="preserve"> PAGEREF _Toc209624210 \h </w:instrText>
+        </w:r>
+        <w:r>
+          <w:rPr>
+            <w:noProof/>
+            <w:webHidden/>
+            <w:sz w:val="22"/>
+            <w:szCs w:val="22"/>
+          </w:rPr>
+        </w:r>
+        <w:r>
+          <w:rPr>
+            <w:noProof/>
+            <w:webHidden/>
+            <w:sz w:val="22"/>
+            <w:szCs w:val="22"/>
           </w:rPr>
           <w:fldChar w:fldCharType="separate"/>
         </w:r>
@@ -1422,6 +1506,8 @@
           <w:rPr>
             <w:noProof/>
             <w:webHidden/>
+            <w:sz w:val="22"/>
+            <w:szCs w:val="22"/>
           </w:rPr>
           <w:t>3</w:t>
         </w:r>
@@ -1429,6 +1515,8 @@
           <w:rPr>
             <w:noProof/>
             <w:webHidden/>
+            <w:sz w:val="22"/>
+            <w:szCs w:val="22"/>
           </w:rPr>
           <w:fldChar w:fldCharType="end"/>
         </w:r>
@@ -1442,53 +1530,61 @@
           <w:tab w:val="right" w:leader="underscore" w:pos="9016"/>
         </w:tabs>
         <w:rPr>
-          <w:rFonts w:eastAsiaTheme="minorEastAsia"/>
+          <w:rFonts w:asciiTheme="minorHAnsi" w:eastAsiaTheme="minorEastAsia" w:hAnsiTheme="minorHAnsi"/>
           <w:b w:val="0"/>
           <w:bCs w:val="0"/>
           <w:noProof/>
-          <w:sz w:val="24"/>
-          <w:szCs w:val="24"/>
+          <w:sz w:val="28"/>
+          <w:szCs w:val="28"/>
           <w:lang w:val="en-CH" w:eastAsia="en-CH"/>
         </w:rPr>
       </w:pPr>
-      <w:hyperlink w:anchor="_Toc209175203" w:history="1">
+      <w:hyperlink w:anchor="_Toc209624211" w:history="1">
         <w:r>
           <w:rPr>
             <w:rStyle w:val="Hyperlink"/>
             <w:noProof/>
+            <w:sz w:val="24"/>
+            <w:szCs w:val="24"/>
           </w:rPr>
           <w:t>2.</w:t>
         </w:r>
         <w:r>
           <w:rPr>
-            <w:rFonts w:eastAsiaTheme="minorEastAsia"/>
+            <w:rFonts w:asciiTheme="minorHAnsi" w:eastAsiaTheme="minorEastAsia" w:hAnsiTheme="minorHAnsi"/>
             <w:b w:val="0"/>
             <w:bCs w:val="0"/>
             <w:noProof/>
+            <w:sz w:val="28"/>
+            <w:szCs w:val="28"/>
+            <w:lang w:val="en-CH" w:eastAsia="en-CH"/>
+          </w:rPr>
+          <w:tab/>
+        </w:r>
+        <w:r>
+          <w:rPr>
+            <w:rStyle w:val="Hyperlink"/>
+            <w:noProof/>
             <w:sz w:val="24"/>
             <w:szCs w:val="24"/>
-            <w:lang w:val="en-CH" w:eastAsia="en-CH"/>
+          </w:rPr>
+          <w:t>Wichtige Begriffe &amp; Symbole</w:t>
+        </w:r>
+        <w:r>
+          <w:rPr>
+            <w:noProof/>
+            <w:webHidden/>
+            <w:sz w:val="24"/>
+            <w:szCs w:val="24"/>
           </w:rPr>
           <w:tab/>
         </w:r>
         <w:r>
           <w:rPr>
-            <w:rStyle w:val="Hyperlink"/>
-            <w:noProof/>
-          </w:rPr>
-          <w:t>Wichtige Begriffe &amp; Symbole</w:t>
-        </w:r>
-        <w:r>
-          <w:rPr>
-            <w:noProof/>
-            <w:webHidden/>
-          </w:rPr>
-          <w:tab/>
-        </w:r>
-        <w:r>
-          <w:rPr>
-            <w:noProof/>
-            <w:webHidden/>
+            <w:noProof/>
+            <w:webHidden/>
+            <w:sz w:val="24"/>
+            <w:szCs w:val="24"/>
           </w:rPr>
           <w:fldChar w:fldCharType="begin"/>
         </w:r>
@@ -1496,19 +1592,25 @@
           <w:rPr>
             <w:noProof/>
             <w:webHidden/>
-          </w:rPr>
-          <w:instrText xml:space="preserve"> PAGEREF _Toc209175203 \h </w:instrText>
-        </w:r>
-        <w:r>
-          <w:rPr>
-            <w:noProof/>
-            <w:webHidden/>
-          </w:rPr>
-        </w:r>
-        <w:r>
-          <w:rPr>
-            <w:noProof/>
-            <w:webHidden/>
+            <w:sz w:val="24"/>
+            <w:szCs w:val="24"/>
+          </w:rPr>
+          <w:instrText xml:space="preserve"> PAGEREF _Toc209624211 \h </w:instrText>
+        </w:r>
+        <w:r>
+          <w:rPr>
+            <w:noProof/>
+            <w:webHidden/>
+            <w:sz w:val="24"/>
+            <w:szCs w:val="24"/>
+          </w:rPr>
+        </w:r>
+        <w:r>
+          <w:rPr>
+            <w:noProof/>
+            <w:webHidden/>
+            <w:sz w:val="24"/>
+            <w:szCs w:val="24"/>
           </w:rPr>
           <w:fldChar w:fldCharType="separate"/>
         </w:r>
@@ -1516,6 +1618,8 @@
           <w:rPr>
             <w:noProof/>
             <w:webHidden/>
+            <w:sz w:val="24"/>
+            <w:szCs w:val="24"/>
           </w:rPr>
           <w:t>4</w:t>
         </w:r>
@@ -1523,6 +1627,8 @@
           <w:rPr>
             <w:noProof/>
             <w:webHidden/>
+            <w:sz w:val="24"/>
+            <w:szCs w:val="24"/>
           </w:rPr>
           <w:fldChar w:fldCharType="end"/>
         </w:r>
@@ -1536,53 +1642,61 @@
           <w:tab w:val="right" w:leader="underscore" w:pos="9016"/>
         </w:tabs>
         <w:rPr>
-          <w:rFonts w:eastAsiaTheme="minorEastAsia"/>
+          <w:rFonts w:asciiTheme="minorHAnsi" w:eastAsiaTheme="minorEastAsia" w:hAnsiTheme="minorHAnsi"/>
           <w:b w:val="0"/>
           <w:bCs w:val="0"/>
           <w:noProof/>
-          <w:sz w:val="24"/>
-          <w:szCs w:val="24"/>
+          <w:sz w:val="28"/>
+          <w:szCs w:val="28"/>
           <w:lang w:val="en-CH" w:eastAsia="en-CH"/>
         </w:rPr>
       </w:pPr>
-      <w:hyperlink w:anchor="_Toc209175204" w:history="1">
+      <w:hyperlink w:anchor="_Toc209624212" w:history="1">
         <w:r>
           <w:rPr>
             <w:rStyle w:val="Hyperlink"/>
             <w:noProof/>
+            <w:sz w:val="24"/>
+            <w:szCs w:val="24"/>
           </w:rPr>
           <w:t>3.</w:t>
         </w:r>
         <w:r>
           <w:rPr>
-            <w:rFonts w:eastAsiaTheme="minorEastAsia"/>
+            <w:rFonts w:asciiTheme="minorHAnsi" w:eastAsiaTheme="minorEastAsia" w:hAnsiTheme="minorHAnsi"/>
             <w:b w:val="0"/>
             <w:bCs w:val="0"/>
             <w:noProof/>
+            <w:sz w:val="28"/>
+            <w:szCs w:val="28"/>
+            <w:lang w:val="en-CH" w:eastAsia="en-CH"/>
+          </w:rPr>
+          <w:tab/>
+        </w:r>
+        <w:r>
+          <w:rPr>
+            <w:rStyle w:val="Hyperlink"/>
+            <w:noProof/>
             <w:sz w:val="24"/>
             <w:szCs w:val="24"/>
-            <w:lang w:val="en-CH" w:eastAsia="en-CH"/>
+          </w:rPr>
+          <w:t>Installation</w:t>
+        </w:r>
+        <w:r>
+          <w:rPr>
+            <w:noProof/>
+            <w:webHidden/>
+            <w:sz w:val="24"/>
+            <w:szCs w:val="24"/>
           </w:rPr>
           <w:tab/>
         </w:r>
         <w:r>
           <w:rPr>
-            <w:rStyle w:val="Hyperlink"/>
-            <w:noProof/>
-          </w:rPr>
-          <w:t>Installation</w:t>
-        </w:r>
-        <w:r>
-          <w:rPr>
-            <w:noProof/>
-            <w:webHidden/>
-          </w:rPr>
-          <w:tab/>
-        </w:r>
-        <w:r>
-          <w:rPr>
-            <w:noProof/>
-            <w:webHidden/>
+            <w:noProof/>
+            <w:webHidden/>
+            <w:sz w:val="24"/>
+            <w:szCs w:val="24"/>
           </w:rPr>
           <w:fldChar w:fldCharType="begin"/>
         </w:r>
@@ -1590,19 +1704,25 @@
           <w:rPr>
             <w:noProof/>
             <w:webHidden/>
-          </w:rPr>
-          <w:instrText xml:space="preserve"> PAGEREF _Toc209175204 \h </w:instrText>
-        </w:r>
-        <w:r>
-          <w:rPr>
-            <w:noProof/>
-            <w:webHidden/>
-          </w:rPr>
-        </w:r>
-        <w:r>
-          <w:rPr>
-            <w:noProof/>
-            <w:webHidden/>
+            <w:sz w:val="24"/>
+            <w:szCs w:val="24"/>
+          </w:rPr>
+          <w:instrText xml:space="preserve"> PAGEREF _Toc209624212 \h </w:instrText>
+        </w:r>
+        <w:r>
+          <w:rPr>
+            <w:noProof/>
+            <w:webHidden/>
+            <w:sz w:val="24"/>
+            <w:szCs w:val="24"/>
+          </w:rPr>
+        </w:r>
+        <w:r>
+          <w:rPr>
+            <w:noProof/>
+            <w:webHidden/>
+            <w:sz w:val="24"/>
+            <w:szCs w:val="24"/>
           </w:rPr>
           <w:fldChar w:fldCharType="separate"/>
         </w:r>
@@ -1610,6 +1730,8 @@
           <w:rPr>
             <w:noProof/>
             <w:webHidden/>
+            <w:sz w:val="24"/>
+            <w:szCs w:val="24"/>
           </w:rPr>
           <w:t>5</w:t>
         </w:r>
@@ -1617,6 +1739,8 @@
           <w:rPr>
             <w:noProof/>
             <w:webHidden/>
+            <w:sz w:val="24"/>
+            <w:szCs w:val="24"/>
           </w:rPr>
           <w:fldChar w:fldCharType="end"/>
         </w:r>
@@ -1629,18 +1753,20 @@
           <w:tab w:val="right" w:leader="underscore" w:pos="9016"/>
         </w:tabs>
         <w:rPr>
-          <w:rFonts w:eastAsiaTheme="minorEastAsia"/>
+          <w:rFonts w:asciiTheme="minorHAnsi" w:eastAsiaTheme="minorEastAsia" w:hAnsiTheme="minorHAnsi"/>
           <w:noProof/>
-          <w:sz w:val="24"/>
-          <w:szCs w:val="24"/>
+          <w:sz w:val="28"/>
+          <w:szCs w:val="28"/>
           <w:lang w:val="en-CH" w:eastAsia="en-CH"/>
         </w:rPr>
       </w:pPr>
-      <w:hyperlink w:anchor="_Toc209175205" w:history="1">
+      <w:hyperlink w:anchor="_Toc209624213" w:history="1">
         <w:r>
           <w:rPr>
             <w:rStyle w:val="Hyperlink"/>
             <w:noProof/>
+            <w:sz w:val="22"/>
+            <w:szCs w:val="22"/>
           </w:rPr>
           <w:t>Schritt für Schritt</w:t>
         </w:r>
@@ -1648,6 +1774,8 @@
           <w:rPr>
             <w:noProof/>
             <w:webHidden/>
+            <w:sz w:val="22"/>
+            <w:szCs w:val="22"/>
           </w:rPr>
           <w:tab/>
         </w:r>
@@ -1655,6 +1783,8 @@
           <w:rPr>
             <w:noProof/>
             <w:webHidden/>
+            <w:sz w:val="22"/>
+            <w:szCs w:val="22"/>
           </w:rPr>
           <w:fldChar w:fldCharType="begin"/>
         </w:r>
@@ -1662,19 +1792,25 @@
           <w:rPr>
             <w:noProof/>
             <w:webHidden/>
-          </w:rPr>
-          <w:instrText xml:space="preserve"> PAGEREF _Toc209175205 \h </w:instrText>
-        </w:r>
-        <w:r>
-          <w:rPr>
-            <w:noProof/>
-            <w:webHidden/>
-          </w:rPr>
-        </w:r>
-        <w:r>
-          <w:rPr>
-            <w:noProof/>
-            <w:webHidden/>
+            <w:sz w:val="22"/>
+            <w:szCs w:val="22"/>
+          </w:rPr>
+          <w:instrText xml:space="preserve"> PAGEREF _Toc209624213 \h </w:instrText>
+        </w:r>
+        <w:r>
+          <w:rPr>
+            <w:noProof/>
+            <w:webHidden/>
+            <w:sz w:val="22"/>
+            <w:szCs w:val="22"/>
+          </w:rPr>
+        </w:r>
+        <w:r>
+          <w:rPr>
+            <w:noProof/>
+            <w:webHidden/>
+            <w:sz w:val="22"/>
+            <w:szCs w:val="22"/>
           </w:rPr>
           <w:fldChar w:fldCharType="separate"/>
         </w:r>
@@ -1682,6 +1818,8 @@
           <w:rPr>
             <w:noProof/>
             <w:webHidden/>
+            <w:sz w:val="22"/>
+            <w:szCs w:val="22"/>
           </w:rPr>
           <w:t>5</w:t>
         </w:r>
@@ -1689,6 +1827,8 @@
           <w:rPr>
             <w:noProof/>
             <w:webHidden/>
+            <w:sz w:val="22"/>
+            <w:szCs w:val="22"/>
           </w:rPr>
           <w:fldChar w:fldCharType="end"/>
         </w:r>
@@ -1702,53 +1842,61 @@
           <w:tab w:val="right" w:leader="underscore" w:pos="9016"/>
         </w:tabs>
         <w:rPr>
-          <w:rFonts w:eastAsiaTheme="minorEastAsia"/>
+          <w:rFonts w:asciiTheme="minorHAnsi" w:eastAsiaTheme="minorEastAsia" w:hAnsiTheme="minorHAnsi"/>
           <w:b w:val="0"/>
           <w:bCs w:val="0"/>
           <w:noProof/>
-          <w:sz w:val="24"/>
-          <w:szCs w:val="24"/>
+          <w:sz w:val="28"/>
+          <w:szCs w:val="28"/>
           <w:lang w:val="en-CH" w:eastAsia="en-CH"/>
         </w:rPr>
       </w:pPr>
-      <w:hyperlink w:anchor="_Toc209175206" w:history="1">
+      <w:hyperlink w:anchor="_Toc209624214" w:history="1">
         <w:r>
           <w:rPr>
             <w:rStyle w:val="Hyperlink"/>
             <w:noProof/>
+            <w:sz w:val="24"/>
+            <w:szCs w:val="24"/>
           </w:rPr>
           <w:t>4.</w:t>
         </w:r>
         <w:r>
           <w:rPr>
-            <w:rFonts w:eastAsiaTheme="minorEastAsia"/>
+            <w:rFonts w:asciiTheme="minorHAnsi" w:eastAsiaTheme="minorEastAsia" w:hAnsiTheme="minorHAnsi"/>
             <w:b w:val="0"/>
             <w:bCs w:val="0"/>
             <w:noProof/>
+            <w:sz w:val="28"/>
+            <w:szCs w:val="28"/>
+            <w:lang w:val="en-CH" w:eastAsia="en-CH"/>
+          </w:rPr>
+          <w:tab/>
+        </w:r>
+        <w:r>
+          <w:rPr>
+            <w:rStyle w:val="Hyperlink"/>
+            <w:noProof/>
             <w:sz w:val="24"/>
             <w:szCs w:val="24"/>
-            <w:lang w:val="en-CH" w:eastAsia="en-CH"/>
+          </w:rPr>
+          <w:t>Erste Schritte</w:t>
+        </w:r>
+        <w:r>
+          <w:rPr>
+            <w:noProof/>
+            <w:webHidden/>
+            <w:sz w:val="24"/>
+            <w:szCs w:val="24"/>
           </w:rPr>
           <w:tab/>
         </w:r>
         <w:r>
           <w:rPr>
-            <w:rStyle w:val="Hyperlink"/>
-            <w:noProof/>
-          </w:rPr>
-          <w:t>Erste Schritte</w:t>
-        </w:r>
-        <w:r>
-          <w:rPr>
-            <w:noProof/>
-            <w:webHidden/>
-          </w:rPr>
-          <w:tab/>
-        </w:r>
-        <w:r>
-          <w:rPr>
-            <w:noProof/>
-            <w:webHidden/>
+            <w:noProof/>
+            <w:webHidden/>
+            <w:sz w:val="24"/>
+            <w:szCs w:val="24"/>
           </w:rPr>
           <w:fldChar w:fldCharType="begin"/>
         </w:r>
@@ -1756,19 +1904,25 @@
           <w:rPr>
             <w:noProof/>
             <w:webHidden/>
-          </w:rPr>
-          <w:instrText xml:space="preserve"> PAGEREF _Toc209175206 \h </w:instrText>
-        </w:r>
-        <w:r>
-          <w:rPr>
-            <w:noProof/>
-            <w:webHidden/>
-          </w:rPr>
-        </w:r>
-        <w:r>
-          <w:rPr>
-            <w:noProof/>
-            <w:webHidden/>
+            <w:sz w:val="24"/>
+            <w:szCs w:val="24"/>
+          </w:rPr>
+          <w:instrText xml:space="preserve"> PAGEREF _Toc209624214 \h </w:instrText>
+        </w:r>
+        <w:r>
+          <w:rPr>
+            <w:noProof/>
+            <w:webHidden/>
+            <w:sz w:val="24"/>
+            <w:szCs w:val="24"/>
+          </w:rPr>
+        </w:r>
+        <w:r>
+          <w:rPr>
+            <w:noProof/>
+            <w:webHidden/>
+            <w:sz w:val="24"/>
+            <w:szCs w:val="24"/>
           </w:rPr>
           <w:fldChar w:fldCharType="separate"/>
         </w:r>
@@ -1776,6 +1930,8 @@
           <w:rPr>
             <w:noProof/>
             <w:webHidden/>
+            <w:sz w:val="24"/>
+            <w:szCs w:val="24"/>
           </w:rPr>
           <w:t>6</w:t>
         </w:r>
@@ -1783,6 +1939,8 @@
           <w:rPr>
             <w:noProof/>
             <w:webHidden/>
+            <w:sz w:val="24"/>
+            <w:szCs w:val="24"/>
           </w:rPr>
           <w:fldChar w:fldCharType="end"/>
         </w:r>
@@ -1795,18 +1953,20 @@
           <w:tab w:val="right" w:leader="underscore" w:pos="9016"/>
         </w:tabs>
         <w:rPr>
-          <w:rFonts w:eastAsiaTheme="minorEastAsia"/>
+          <w:rFonts w:asciiTheme="minorHAnsi" w:eastAsiaTheme="minorEastAsia" w:hAnsiTheme="minorHAnsi"/>
           <w:noProof/>
-          <w:sz w:val="24"/>
-          <w:szCs w:val="24"/>
+          <w:sz w:val="28"/>
+          <w:szCs w:val="28"/>
           <w:lang w:val="en-CH" w:eastAsia="en-CH"/>
         </w:rPr>
       </w:pPr>
-      <w:hyperlink w:anchor="_Toc209175207" w:history="1">
+      <w:hyperlink w:anchor="_Toc209624215" w:history="1">
         <w:r>
           <w:rPr>
             <w:rStyle w:val="Hyperlink"/>
             <w:noProof/>
+            <w:sz w:val="22"/>
+            <w:szCs w:val="22"/>
           </w:rPr>
           <w:t>Erster Start</w:t>
         </w:r>
@@ -1814,6 +1974,8 @@
           <w:rPr>
             <w:noProof/>
             <w:webHidden/>
+            <w:sz w:val="22"/>
+            <w:szCs w:val="22"/>
           </w:rPr>
           <w:tab/>
         </w:r>
@@ -1821,6 +1983,8 @@
           <w:rPr>
             <w:noProof/>
             <w:webHidden/>
+            <w:sz w:val="22"/>
+            <w:szCs w:val="22"/>
           </w:rPr>
           <w:fldChar w:fldCharType="begin"/>
         </w:r>
@@ -1828,19 +1992,25 @@
           <w:rPr>
             <w:noProof/>
             <w:webHidden/>
-          </w:rPr>
-          <w:instrText xml:space="preserve"> PAGEREF _Toc209175207 \h </w:instrText>
-        </w:r>
-        <w:r>
-          <w:rPr>
-            <w:noProof/>
-            <w:webHidden/>
-          </w:rPr>
-        </w:r>
-        <w:r>
-          <w:rPr>
-            <w:noProof/>
-            <w:webHidden/>
+            <w:sz w:val="22"/>
+            <w:szCs w:val="22"/>
+          </w:rPr>
+          <w:instrText xml:space="preserve"> PAGEREF _Toc209624215 \h </w:instrText>
+        </w:r>
+        <w:r>
+          <w:rPr>
+            <w:noProof/>
+            <w:webHidden/>
+            <w:sz w:val="22"/>
+            <w:szCs w:val="22"/>
+          </w:rPr>
+        </w:r>
+        <w:r>
+          <w:rPr>
+            <w:noProof/>
+            <w:webHidden/>
+            <w:sz w:val="22"/>
+            <w:szCs w:val="22"/>
           </w:rPr>
           <w:fldChar w:fldCharType="separate"/>
         </w:r>
@@ -1848,6 +2018,8 @@
           <w:rPr>
             <w:noProof/>
             <w:webHidden/>
+            <w:sz w:val="22"/>
+            <w:szCs w:val="22"/>
           </w:rPr>
           <w:t>6</w:t>
         </w:r>
@@ -1855,6 +2027,8 @@
           <w:rPr>
             <w:noProof/>
             <w:webHidden/>
+            <w:sz w:val="22"/>
+            <w:szCs w:val="22"/>
           </w:rPr>
           <w:fldChar w:fldCharType="end"/>
         </w:r>
@@ -1867,18 +2041,20 @@
           <w:tab w:val="right" w:leader="underscore" w:pos="9016"/>
         </w:tabs>
         <w:rPr>
-          <w:rFonts w:eastAsiaTheme="minorEastAsia"/>
+          <w:rFonts w:asciiTheme="minorHAnsi" w:eastAsiaTheme="minorEastAsia" w:hAnsiTheme="minorHAnsi"/>
           <w:noProof/>
-          <w:sz w:val="24"/>
-          <w:szCs w:val="24"/>
+          <w:sz w:val="28"/>
+          <w:szCs w:val="28"/>
           <w:lang w:val="en-CH" w:eastAsia="en-CH"/>
         </w:rPr>
       </w:pPr>
-      <w:hyperlink w:anchor="_Toc209175208" w:history="1">
+      <w:hyperlink w:anchor="_Toc209624216" w:history="1">
         <w:r>
           <w:rPr>
             <w:rStyle w:val="Hyperlink"/>
             <w:noProof/>
+            <w:sz w:val="22"/>
+            <w:szCs w:val="22"/>
           </w:rPr>
           <w:t>Einfache Transkription</w:t>
         </w:r>
@@ -1886,6 +2062,8 @@
           <w:rPr>
             <w:noProof/>
             <w:webHidden/>
+            <w:sz w:val="22"/>
+            <w:szCs w:val="22"/>
           </w:rPr>
           <w:tab/>
         </w:r>
@@ -1893,6 +2071,8 @@
           <w:rPr>
             <w:noProof/>
             <w:webHidden/>
+            <w:sz w:val="22"/>
+            <w:szCs w:val="22"/>
           </w:rPr>
           <w:fldChar w:fldCharType="begin"/>
         </w:r>
@@ -1900,19 +2080,25 @@
           <w:rPr>
             <w:noProof/>
             <w:webHidden/>
-          </w:rPr>
-          <w:instrText xml:space="preserve"> PAGEREF _Toc209175208 \h </w:instrText>
-        </w:r>
-        <w:r>
-          <w:rPr>
-            <w:noProof/>
-            <w:webHidden/>
-          </w:rPr>
-        </w:r>
-        <w:r>
-          <w:rPr>
-            <w:noProof/>
-            <w:webHidden/>
+            <w:sz w:val="22"/>
+            <w:szCs w:val="22"/>
+          </w:rPr>
+          <w:instrText xml:space="preserve"> PAGEREF _Toc209624216 \h </w:instrText>
+        </w:r>
+        <w:r>
+          <w:rPr>
+            <w:noProof/>
+            <w:webHidden/>
+            <w:sz w:val="22"/>
+            <w:szCs w:val="22"/>
+          </w:rPr>
+        </w:r>
+        <w:r>
+          <w:rPr>
+            <w:noProof/>
+            <w:webHidden/>
+            <w:sz w:val="22"/>
+            <w:szCs w:val="22"/>
           </w:rPr>
           <w:fldChar w:fldCharType="separate"/>
         </w:r>
@@ -1920,6 +2106,8 @@
           <w:rPr>
             <w:noProof/>
             <w:webHidden/>
+            <w:sz w:val="22"/>
+            <w:szCs w:val="22"/>
           </w:rPr>
           <w:t>6</w:t>
         </w:r>
@@ -1927,6 +2115,8 @@
           <w:rPr>
             <w:noProof/>
             <w:webHidden/>
+            <w:sz w:val="22"/>
+            <w:szCs w:val="22"/>
           </w:rPr>
           <w:fldChar w:fldCharType="end"/>
         </w:r>
@@ -1940,53 +2130,61 @@
           <w:tab w:val="right" w:leader="underscore" w:pos="9016"/>
         </w:tabs>
         <w:rPr>
-          <w:rFonts w:eastAsiaTheme="minorEastAsia"/>
+          <w:rFonts w:asciiTheme="minorHAnsi" w:eastAsiaTheme="minorEastAsia" w:hAnsiTheme="minorHAnsi"/>
           <w:b w:val="0"/>
           <w:bCs w:val="0"/>
           <w:noProof/>
-          <w:sz w:val="24"/>
-          <w:szCs w:val="24"/>
+          <w:sz w:val="28"/>
+          <w:szCs w:val="28"/>
           <w:lang w:val="en-CH" w:eastAsia="en-CH"/>
         </w:rPr>
       </w:pPr>
-      <w:hyperlink w:anchor="_Toc209175209" w:history="1">
+      <w:hyperlink w:anchor="_Toc209624217" w:history="1">
         <w:r>
           <w:rPr>
             <w:rStyle w:val="Hyperlink"/>
             <w:noProof/>
+            <w:sz w:val="24"/>
+            <w:szCs w:val="24"/>
           </w:rPr>
           <w:t>5.</w:t>
         </w:r>
         <w:r>
           <w:rPr>
-            <w:rFonts w:eastAsiaTheme="minorEastAsia"/>
+            <w:rFonts w:asciiTheme="minorHAnsi" w:eastAsiaTheme="minorEastAsia" w:hAnsiTheme="minorHAnsi"/>
             <w:b w:val="0"/>
             <w:bCs w:val="0"/>
             <w:noProof/>
+            <w:sz w:val="28"/>
+            <w:szCs w:val="28"/>
+            <w:lang w:val="en-CH" w:eastAsia="en-CH"/>
+          </w:rPr>
+          <w:tab/>
+        </w:r>
+        <w:r>
+          <w:rPr>
+            <w:rStyle w:val="Hyperlink"/>
+            <w:noProof/>
             <w:sz w:val="24"/>
             <w:szCs w:val="24"/>
-            <w:lang w:val="en-CH" w:eastAsia="en-CH"/>
+          </w:rPr>
+          <w:t>User Interface</w:t>
+        </w:r>
+        <w:r>
+          <w:rPr>
+            <w:noProof/>
+            <w:webHidden/>
+            <w:sz w:val="24"/>
+            <w:szCs w:val="24"/>
           </w:rPr>
           <w:tab/>
         </w:r>
         <w:r>
           <w:rPr>
-            <w:rStyle w:val="Hyperlink"/>
-            <w:noProof/>
-          </w:rPr>
-          <w:t>User Interface</w:t>
-        </w:r>
-        <w:r>
-          <w:rPr>
-            <w:noProof/>
-            <w:webHidden/>
-          </w:rPr>
-          <w:tab/>
-        </w:r>
-        <w:r>
-          <w:rPr>
-            <w:noProof/>
-            <w:webHidden/>
+            <w:noProof/>
+            <w:webHidden/>
+            <w:sz w:val="24"/>
+            <w:szCs w:val="24"/>
           </w:rPr>
           <w:fldChar w:fldCharType="begin"/>
         </w:r>
@@ -1994,19 +2192,25 @@
           <w:rPr>
             <w:noProof/>
             <w:webHidden/>
-          </w:rPr>
-          <w:instrText xml:space="preserve"> PAGEREF _Toc209175209 \h </w:instrText>
-        </w:r>
-        <w:r>
-          <w:rPr>
-            <w:noProof/>
-            <w:webHidden/>
-          </w:rPr>
-        </w:r>
-        <w:r>
-          <w:rPr>
-            <w:noProof/>
-            <w:webHidden/>
+            <w:sz w:val="24"/>
+            <w:szCs w:val="24"/>
+          </w:rPr>
+          <w:instrText xml:space="preserve"> PAGEREF _Toc209624217 \h </w:instrText>
+        </w:r>
+        <w:r>
+          <w:rPr>
+            <w:noProof/>
+            <w:webHidden/>
+            <w:sz w:val="24"/>
+            <w:szCs w:val="24"/>
+          </w:rPr>
+        </w:r>
+        <w:r>
+          <w:rPr>
+            <w:noProof/>
+            <w:webHidden/>
+            <w:sz w:val="24"/>
+            <w:szCs w:val="24"/>
           </w:rPr>
           <w:fldChar w:fldCharType="separate"/>
         </w:r>
@@ -2014,6 +2218,8 @@
           <w:rPr>
             <w:noProof/>
             <w:webHidden/>
+            <w:sz w:val="24"/>
+            <w:szCs w:val="24"/>
           </w:rPr>
           <w:t>7</w:t>
         </w:r>
@@ -2021,6 +2227,8 @@
           <w:rPr>
             <w:noProof/>
             <w:webHidden/>
+            <w:sz w:val="24"/>
+            <w:szCs w:val="24"/>
           </w:rPr>
           <w:fldChar w:fldCharType="end"/>
         </w:r>
@@ -2033,18 +2241,20 @@
           <w:tab w:val="right" w:leader="underscore" w:pos="9016"/>
         </w:tabs>
         <w:rPr>
-          <w:rFonts w:eastAsiaTheme="minorEastAsia"/>
+          <w:rFonts w:asciiTheme="minorHAnsi" w:eastAsiaTheme="minorEastAsia" w:hAnsiTheme="minorHAnsi"/>
           <w:noProof/>
-          <w:sz w:val="24"/>
-          <w:szCs w:val="24"/>
+          <w:sz w:val="28"/>
+          <w:szCs w:val="28"/>
           <w:lang w:val="en-CH" w:eastAsia="en-CH"/>
         </w:rPr>
       </w:pPr>
-      <w:hyperlink w:anchor="_Toc209175210" w:history="1">
+      <w:hyperlink w:anchor="_Toc209624218" w:history="1">
         <w:r>
           <w:rPr>
             <w:rStyle w:val="Hyperlink"/>
             <w:noProof/>
+            <w:sz w:val="22"/>
+            <w:szCs w:val="22"/>
           </w:rPr>
           <w:t>Steuerelemente</w:t>
         </w:r>
@@ -2052,6 +2262,8 @@
           <w:rPr>
             <w:noProof/>
             <w:webHidden/>
+            <w:sz w:val="22"/>
+            <w:szCs w:val="22"/>
           </w:rPr>
           <w:tab/>
         </w:r>
@@ -2059,6 +2271,8 @@
           <w:rPr>
             <w:noProof/>
             <w:webHidden/>
+            <w:sz w:val="22"/>
+            <w:szCs w:val="22"/>
           </w:rPr>
           <w:fldChar w:fldCharType="begin"/>
         </w:r>
@@ -2066,19 +2280,25 @@
           <w:rPr>
             <w:noProof/>
             <w:webHidden/>
-          </w:rPr>
-          <w:instrText xml:space="preserve"> PAGEREF _Toc209175210 \h </w:instrText>
-        </w:r>
-        <w:r>
-          <w:rPr>
-            <w:noProof/>
-            <w:webHidden/>
-          </w:rPr>
-        </w:r>
-        <w:r>
-          <w:rPr>
-            <w:noProof/>
-            <w:webHidden/>
+            <w:sz w:val="22"/>
+            <w:szCs w:val="22"/>
+          </w:rPr>
+          <w:instrText xml:space="preserve"> PAGEREF _Toc209624218 \h </w:instrText>
+        </w:r>
+        <w:r>
+          <w:rPr>
+            <w:noProof/>
+            <w:webHidden/>
+            <w:sz w:val="22"/>
+            <w:szCs w:val="22"/>
+          </w:rPr>
+        </w:r>
+        <w:r>
+          <w:rPr>
+            <w:noProof/>
+            <w:webHidden/>
+            <w:sz w:val="22"/>
+            <w:szCs w:val="22"/>
           </w:rPr>
           <w:fldChar w:fldCharType="separate"/>
         </w:r>
@@ -2086,6 +2306,8 @@
           <w:rPr>
             <w:noProof/>
             <w:webHidden/>
+            <w:sz w:val="22"/>
+            <w:szCs w:val="22"/>
           </w:rPr>
           <w:t>7</w:t>
         </w:r>
@@ -2093,6 +2315,8 @@
           <w:rPr>
             <w:noProof/>
             <w:webHidden/>
+            <w:sz w:val="22"/>
+            <w:szCs w:val="22"/>
           </w:rPr>
           <w:fldChar w:fldCharType="end"/>
         </w:r>
@@ -2105,18 +2329,20 @@
           <w:tab w:val="right" w:leader="underscore" w:pos="9016"/>
         </w:tabs>
         <w:rPr>
-          <w:rFonts w:eastAsiaTheme="minorEastAsia"/>
+          <w:rFonts w:asciiTheme="minorHAnsi" w:eastAsiaTheme="minorEastAsia" w:hAnsiTheme="minorHAnsi"/>
           <w:noProof/>
-          <w:sz w:val="24"/>
-          <w:szCs w:val="24"/>
+          <w:sz w:val="28"/>
+          <w:szCs w:val="28"/>
           <w:lang w:val="en-CH" w:eastAsia="en-CH"/>
         </w:rPr>
       </w:pPr>
-      <w:hyperlink w:anchor="_Toc209175211" w:history="1">
+      <w:hyperlink w:anchor="_Toc209624219" w:history="1">
         <w:r>
           <w:rPr>
             <w:rStyle w:val="Hyperlink"/>
             <w:noProof/>
+            <w:sz w:val="22"/>
+            <w:szCs w:val="22"/>
           </w:rPr>
           <w:t>Zuhören Starten/Beenden</w:t>
         </w:r>
@@ -2124,6 +2350,8 @@
           <w:rPr>
             <w:noProof/>
             <w:webHidden/>
+            <w:sz w:val="22"/>
+            <w:szCs w:val="22"/>
           </w:rPr>
           <w:tab/>
         </w:r>
@@ -2131,6 +2359,8 @@
           <w:rPr>
             <w:noProof/>
             <w:webHidden/>
+            <w:sz w:val="22"/>
+            <w:szCs w:val="22"/>
           </w:rPr>
           <w:fldChar w:fldCharType="begin"/>
         </w:r>
@@ -2138,19 +2368,25 @@
           <w:rPr>
             <w:noProof/>
             <w:webHidden/>
-          </w:rPr>
-          <w:instrText xml:space="preserve"> PAGEREF _Toc209175211 \h </w:instrText>
-        </w:r>
-        <w:r>
-          <w:rPr>
-            <w:noProof/>
-            <w:webHidden/>
-          </w:rPr>
-        </w:r>
-        <w:r>
-          <w:rPr>
-            <w:noProof/>
-            <w:webHidden/>
+            <w:sz w:val="22"/>
+            <w:szCs w:val="22"/>
+          </w:rPr>
+          <w:instrText xml:space="preserve"> PAGEREF _Toc209624219 \h </w:instrText>
+        </w:r>
+        <w:r>
+          <w:rPr>
+            <w:noProof/>
+            <w:webHidden/>
+            <w:sz w:val="22"/>
+            <w:szCs w:val="22"/>
+          </w:rPr>
+        </w:r>
+        <w:r>
+          <w:rPr>
+            <w:noProof/>
+            <w:webHidden/>
+            <w:sz w:val="22"/>
+            <w:szCs w:val="22"/>
           </w:rPr>
           <w:fldChar w:fldCharType="separate"/>
         </w:r>
@@ -2158,6 +2394,8 @@
           <w:rPr>
             <w:noProof/>
             <w:webHidden/>
+            <w:sz w:val="22"/>
+            <w:szCs w:val="22"/>
           </w:rPr>
           <w:t>7</w:t>
         </w:r>
@@ -2165,6 +2403,8 @@
           <w:rPr>
             <w:noProof/>
             <w:webHidden/>
+            <w:sz w:val="22"/>
+            <w:szCs w:val="22"/>
           </w:rPr>
           <w:fldChar w:fldCharType="end"/>
         </w:r>
@@ -2177,18 +2417,20 @@
           <w:tab w:val="right" w:leader="underscore" w:pos="9016"/>
         </w:tabs>
         <w:rPr>
-          <w:rFonts w:eastAsiaTheme="minorEastAsia"/>
+          <w:rFonts w:asciiTheme="minorHAnsi" w:eastAsiaTheme="minorEastAsia" w:hAnsiTheme="minorHAnsi"/>
           <w:noProof/>
-          <w:sz w:val="24"/>
-          <w:szCs w:val="24"/>
+          <w:sz w:val="28"/>
+          <w:szCs w:val="28"/>
           <w:lang w:val="en-CH" w:eastAsia="en-CH"/>
         </w:rPr>
       </w:pPr>
-      <w:hyperlink w:anchor="_Toc209175212" w:history="1">
+      <w:hyperlink w:anchor="_Toc209624220" w:history="1">
         <w:r>
           <w:rPr>
             <w:rStyle w:val="Hyperlink"/>
             <w:noProof/>
+            <w:sz w:val="22"/>
+            <w:szCs w:val="22"/>
           </w:rPr>
           <w:t>Diktat Starten/Beenden</w:t>
         </w:r>
@@ -2196,6 +2438,8 @@
           <w:rPr>
             <w:noProof/>
             <w:webHidden/>
+            <w:sz w:val="22"/>
+            <w:szCs w:val="22"/>
           </w:rPr>
           <w:tab/>
         </w:r>
@@ -2203,6 +2447,8 @@
           <w:rPr>
             <w:noProof/>
             <w:webHidden/>
+            <w:sz w:val="22"/>
+            <w:szCs w:val="22"/>
           </w:rPr>
           <w:fldChar w:fldCharType="begin"/>
         </w:r>
@@ -2210,19 +2456,25 @@
           <w:rPr>
             <w:noProof/>
             <w:webHidden/>
-          </w:rPr>
-          <w:instrText xml:space="preserve"> PAGEREF _Toc209175212 \h </w:instrText>
-        </w:r>
-        <w:r>
-          <w:rPr>
-            <w:noProof/>
-            <w:webHidden/>
-          </w:rPr>
-        </w:r>
-        <w:r>
-          <w:rPr>
-            <w:noProof/>
-            <w:webHidden/>
+            <w:sz w:val="22"/>
+            <w:szCs w:val="22"/>
+          </w:rPr>
+          <w:instrText xml:space="preserve"> PAGEREF _Toc209624220 \h </w:instrText>
+        </w:r>
+        <w:r>
+          <w:rPr>
+            <w:noProof/>
+            <w:webHidden/>
+            <w:sz w:val="22"/>
+            <w:szCs w:val="22"/>
+          </w:rPr>
+        </w:r>
+        <w:r>
+          <w:rPr>
+            <w:noProof/>
+            <w:webHidden/>
+            <w:sz w:val="22"/>
+            <w:szCs w:val="22"/>
           </w:rPr>
           <w:fldChar w:fldCharType="separate"/>
         </w:r>
@@ -2230,6 +2482,8 @@
           <w:rPr>
             <w:noProof/>
             <w:webHidden/>
+            <w:sz w:val="22"/>
+            <w:szCs w:val="22"/>
           </w:rPr>
           <w:t>7</w:t>
         </w:r>
@@ -2237,6 +2491,8 @@
           <w:rPr>
             <w:noProof/>
             <w:webHidden/>
+            <w:sz w:val="22"/>
+            <w:szCs w:val="22"/>
           </w:rPr>
           <w:fldChar w:fldCharType="end"/>
         </w:r>
@@ -2249,18 +2505,20 @@
           <w:tab w:val="right" w:leader="underscore" w:pos="9016"/>
         </w:tabs>
         <w:rPr>
-          <w:rFonts w:eastAsiaTheme="minorEastAsia"/>
+          <w:rFonts w:asciiTheme="minorHAnsi" w:eastAsiaTheme="minorEastAsia" w:hAnsiTheme="minorHAnsi"/>
           <w:noProof/>
-          <w:sz w:val="24"/>
-          <w:szCs w:val="24"/>
+          <w:sz w:val="28"/>
+          <w:szCs w:val="28"/>
           <w:lang w:val="en-CH" w:eastAsia="en-CH"/>
         </w:rPr>
       </w:pPr>
-      <w:hyperlink w:anchor="_Toc209175213" w:history="1">
+      <w:hyperlink w:anchor="_Toc209624221" w:history="1">
         <w:r>
           <w:rPr>
             <w:rStyle w:val="Hyperlink"/>
             <w:noProof/>
+            <w:sz w:val="22"/>
+            <w:szCs w:val="22"/>
           </w:rPr>
           <w:t>Mikrofonauswahl</w:t>
         </w:r>
@@ -2268,6 +2526,8 @@
           <w:rPr>
             <w:noProof/>
             <w:webHidden/>
+            <w:sz w:val="22"/>
+            <w:szCs w:val="22"/>
           </w:rPr>
           <w:tab/>
         </w:r>
@@ -2275,6 +2535,8 @@
           <w:rPr>
             <w:noProof/>
             <w:webHidden/>
+            <w:sz w:val="22"/>
+            <w:szCs w:val="22"/>
           </w:rPr>
           <w:fldChar w:fldCharType="begin"/>
         </w:r>
@@ -2282,19 +2544,25 @@
           <w:rPr>
             <w:noProof/>
             <w:webHidden/>
-          </w:rPr>
-          <w:instrText xml:space="preserve"> PAGEREF _Toc209175213 \h </w:instrText>
-        </w:r>
-        <w:r>
-          <w:rPr>
-            <w:noProof/>
-            <w:webHidden/>
-          </w:rPr>
-        </w:r>
-        <w:r>
-          <w:rPr>
-            <w:noProof/>
-            <w:webHidden/>
+            <w:sz w:val="22"/>
+            <w:szCs w:val="22"/>
+          </w:rPr>
+          <w:instrText xml:space="preserve"> PAGEREF _Toc209624221 \h </w:instrText>
+        </w:r>
+        <w:r>
+          <w:rPr>
+            <w:noProof/>
+            <w:webHidden/>
+            <w:sz w:val="22"/>
+            <w:szCs w:val="22"/>
+          </w:rPr>
+        </w:r>
+        <w:r>
+          <w:rPr>
+            <w:noProof/>
+            <w:webHidden/>
+            <w:sz w:val="22"/>
+            <w:szCs w:val="22"/>
           </w:rPr>
           <w:fldChar w:fldCharType="separate"/>
         </w:r>
@@ -2302,6 +2570,8 @@
           <w:rPr>
             <w:noProof/>
             <w:webHidden/>
+            <w:sz w:val="22"/>
+            <w:szCs w:val="22"/>
           </w:rPr>
           <w:t>8</w:t>
         </w:r>
@@ -2309,6 +2579,8 @@
           <w:rPr>
             <w:noProof/>
             <w:webHidden/>
+            <w:sz w:val="22"/>
+            <w:szCs w:val="22"/>
           </w:rPr>
           <w:fldChar w:fldCharType="end"/>
         </w:r>
@@ -2321,18 +2593,20 @@
           <w:tab w:val="right" w:leader="underscore" w:pos="9016"/>
         </w:tabs>
         <w:rPr>
-          <w:rFonts w:eastAsiaTheme="minorEastAsia"/>
+          <w:rFonts w:asciiTheme="minorHAnsi" w:eastAsiaTheme="minorEastAsia" w:hAnsiTheme="minorHAnsi"/>
           <w:noProof/>
-          <w:sz w:val="24"/>
-          <w:szCs w:val="24"/>
+          <w:sz w:val="28"/>
+          <w:szCs w:val="28"/>
           <w:lang w:val="en-CH" w:eastAsia="en-CH"/>
         </w:rPr>
       </w:pPr>
-      <w:hyperlink w:anchor="_Toc209175214" w:history="1">
+      <w:hyperlink w:anchor="_Toc209624222" w:history="1">
         <w:r>
           <w:rPr>
             <w:rStyle w:val="Hyperlink"/>
             <w:noProof/>
+            <w:sz w:val="22"/>
+            <w:szCs w:val="22"/>
           </w:rPr>
           <w:t>Modelauswahl</w:t>
         </w:r>
@@ -2340,6 +2614,8 @@
           <w:rPr>
             <w:noProof/>
             <w:webHidden/>
+            <w:sz w:val="22"/>
+            <w:szCs w:val="22"/>
           </w:rPr>
           <w:tab/>
         </w:r>
@@ -2347,6 +2623,8 @@
           <w:rPr>
             <w:noProof/>
             <w:webHidden/>
+            <w:sz w:val="22"/>
+            <w:szCs w:val="22"/>
           </w:rPr>
           <w:fldChar w:fldCharType="begin"/>
         </w:r>
@@ -2354,19 +2632,25 @@
           <w:rPr>
             <w:noProof/>
             <w:webHidden/>
-          </w:rPr>
-          <w:instrText xml:space="preserve"> PAGEREF _Toc209175214 \h </w:instrText>
-        </w:r>
-        <w:r>
-          <w:rPr>
-            <w:noProof/>
-            <w:webHidden/>
-          </w:rPr>
-        </w:r>
-        <w:r>
-          <w:rPr>
-            <w:noProof/>
-            <w:webHidden/>
+            <w:sz w:val="22"/>
+            <w:szCs w:val="22"/>
+          </w:rPr>
+          <w:instrText xml:space="preserve"> PAGEREF _Toc209624222 \h </w:instrText>
+        </w:r>
+        <w:r>
+          <w:rPr>
+            <w:noProof/>
+            <w:webHidden/>
+            <w:sz w:val="22"/>
+            <w:szCs w:val="22"/>
+          </w:rPr>
+        </w:r>
+        <w:r>
+          <w:rPr>
+            <w:noProof/>
+            <w:webHidden/>
+            <w:sz w:val="22"/>
+            <w:szCs w:val="22"/>
           </w:rPr>
           <w:fldChar w:fldCharType="separate"/>
         </w:r>
@@ -2374,6 +2658,8 @@
           <w:rPr>
             <w:noProof/>
             <w:webHidden/>
+            <w:sz w:val="22"/>
+            <w:szCs w:val="22"/>
           </w:rPr>
           <w:t>8</w:t>
         </w:r>
@@ -2381,6 +2667,8 @@
           <w:rPr>
             <w:noProof/>
             <w:webHidden/>
+            <w:sz w:val="22"/>
+            <w:szCs w:val="22"/>
           </w:rPr>
           <w:fldChar w:fldCharType="end"/>
         </w:r>
@@ -2393,18 +2681,20 @@
           <w:tab w:val="right" w:leader="underscore" w:pos="9016"/>
         </w:tabs>
         <w:rPr>
-          <w:rFonts w:eastAsiaTheme="minorEastAsia"/>
+          <w:rFonts w:asciiTheme="minorHAnsi" w:eastAsiaTheme="minorEastAsia" w:hAnsiTheme="minorHAnsi"/>
           <w:noProof/>
-          <w:sz w:val="24"/>
-          <w:szCs w:val="24"/>
+          <w:sz w:val="28"/>
+          <w:szCs w:val="28"/>
           <w:lang w:val="en-CH" w:eastAsia="en-CH"/>
         </w:rPr>
       </w:pPr>
-      <w:hyperlink w:anchor="_Toc209175215" w:history="1">
+      <w:hyperlink w:anchor="_Toc209624223" w:history="1">
         <w:r>
           <w:rPr>
             <w:rStyle w:val="Hyperlink"/>
             <w:noProof/>
+            <w:sz w:val="22"/>
+            <w:szCs w:val="22"/>
           </w:rPr>
           <w:t>Sprachauswahl</w:t>
         </w:r>
@@ -2412,6 +2702,8 @@
           <w:rPr>
             <w:noProof/>
             <w:webHidden/>
+            <w:sz w:val="22"/>
+            <w:szCs w:val="22"/>
           </w:rPr>
           <w:tab/>
         </w:r>
@@ -2419,6 +2711,8 @@
           <w:rPr>
             <w:noProof/>
             <w:webHidden/>
+            <w:sz w:val="22"/>
+            <w:szCs w:val="22"/>
           </w:rPr>
           <w:fldChar w:fldCharType="begin"/>
         </w:r>
@@ -2426,19 +2720,25 @@
           <w:rPr>
             <w:noProof/>
             <w:webHidden/>
-          </w:rPr>
-          <w:instrText xml:space="preserve"> PAGEREF _Toc209175215 \h </w:instrText>
-        </w:r>
-        <w:r>
-          <w:rPr>
-            <w:noProof/>
-            <w:webHidden/>
-          </w:rPr>
-        </w:r>
-        <w:r>
-          <w:rPr>
-            <w:noProof/>
-            <w:webHidden/>
+            <w:sz w:val="22"/>
+            <w:szCs w:val="22"/>
+          </w:rPr>
+          <w:instrText xml:space="preserve"> PAGEREF _Toc209624223 \h </w:instrText>
+        </w:r>
+        <w:r>
+          <w:rPr>
+            <w:noProof/>
+            <w:webHidden/>
+            <w:sz w:val="22"/>
+            <w:szCs w:val="22"/>
+          </w:rPr>
+        </w:r>
+        <w:r>
+          <w:rPr>
+            <w:noProof/>
+            <w:webHidden/>
+            <w:sz w:val="22"/>
+            <w:szCs w:val="22"/>
           </w:rPr>
           <w:fldChar w:fldCharType="separate"/>
         </w:r>
@@ -2446,6 +2746,8 @@
           <w:rPr>
             <w:noProof/>
             <w:webHidden/>
+            <w:sz w:val="22"/>
+            <w:szCs w:val="22"/>
           </w:rPr>
           <w:t>8</w:t>
         </w:r>
@@ -2453,6 +2755,8 @@
           <w:rPr>
             <w:noProof/>
             <w:webHidden/>
+            <w:sz w:val="22"/>
+            <w:szCs w:val="22"/>
           </w:rPr>
           <w:fldChar w:fldCharType="end"/>
         </w:r>
@@ -2465,18 +2769,20 @@
           <w:tab w:val="right" w:leader="underscore" w:pos="9016"/>
         </w:tabs>
         <w:rPr>
-          <w:rFonts w:eastAsiaTheme="minorEastAsia"/>
+          <w:rFonts w:asciiTheme="minorHAnsi" w:eastAsiaTheme="minorEastAsia" w:hAnsiTheme="minorHAnsi"/>
           <w:noProof/>
-          <w:sz w:val="24"/>
-          <w:szCs w:val="24"/>
+          <w:sz w:val="28"/>
+          <w:szCs w:val="28"/>
           <w:lang w:val="en-CH" w:eastAsia="en-CH"/>
         </w:rPr>
       </w:pPr>
-      <w:hyperlink w:anchor="_Toc209175216" w:history="1">
+      <w:hyperlink w:anchor="_Toc209624224" w:history="1">
         <w:r>
           <w:rPr>
             <w:rStyle w:val="Hyperlink"/>
             <w:noProof/>
+            <w:sz w:val="22"/>
+            <w:szCs w:val="22"/>
           </w:rPr>
           <w:t>Modeleinstellungen</w:t>
         </w:r>
@@ -2484,6 +2790,8 @@
           <w:rPr>
             <w:noProof/>
             <w:webHidden/>
+            <w:sz w:val="22"/>
+            <w:szCs w:val="22"/>
           </w:rPr>
           <w:tab/>
         </w:r>
@@ -2491,6 +2799,8 @@
           <w:rPr>
             <w:noProof/>
             <w:webHidden/>
+            <w:sz w:val="22"/>
+            <w:szCs w:val="22"/>
           </w:rPr>
           <w:fldChar w:fldCharType="begin"/>
         </w:r>
@@ -2498,19 +2808,25 @@
           <w:rPr>
             <w:noProof/>
             <w:webHidden/>
-          </w:rPr>
-          <w:instrText xml:space="preserve"> PAGEREF _Toc209175216 \h </w:instrText>
-        </w:r>
-        <w:r>
-          <w:rPr>
-            <w:noProof/>
-            <w:webHidden/>
-          </w:rPr>
-        </w:r>
-        <w:r>
-          <w:rPr>
-            <w:noProof/>
-            <w:webHidden/>
+            <w:sz w:val="22"/>
+            <w:szCs w:val="22"/>
+          </w:rPr>
+          <w:instrText xml:space="preserve"> PAGEREF _Toc209624224 \h </w:instrText>
+        </w:r>
+        <w:r>
+          <w:rPr>
+            <w:noProof/>
+            <w:webHidden/>
+            <w:sz w:val="22"/>
+            <w:szCs w:val="22"/>
+          </w:rPr>
+        </w:r>
+        <w:r>
+          <w:rPr>
+            <w:noProof/>
+            <w:webHidden/>
+            <w:sz w:val="22"/>
+            <w:szCs w:val="22"/>
           </w:rPr>
           <w:fldChar w:fldCharType="separate"/>
         </w:r>
@@ -2518,6 +2834,8 @@
           <w:rPr>
             <w:noProof/>
             <w:webHidden/>
+            <w:sz w:val="22"/>
+            <w:szCs w:val="22"/>
           </w:rPr>
           <w:t>9</w:t>
         </w:r>
@@ -2525,6 +2843,8 @@
           <w:rPr>
             <w:noProof/>
             <w:webHidden/>
+            <w:sz w:val="22"/>
+            <w:szCs w:val="22"/>
           </w:rPr>
           <w:fldChar w:fldCharType="end"/>
         </w:r>
@@ -2537,18 +2857,20 @@
           <w:tab w:val="right" w:leader="underscore" w:pos="9016"/>
         </w:tabs>
         <w:rPr>
-          <w:rFonts w:eastAsiaTheme="minorEastAsia"/>
+          <w:rFonts w:asciiTheme="minorHAnsi" w:eastAsiaTheme="minorEastAsia" w:hAnsiTheme="minorHAnsi"/>
           <w:noProof/>
-          <w:sz w:val="24"/>
-          <w:szCs w:val="24"/>
+          <w:sz w:val="28"/>
+          <w:szCs w:val="28"/>
           <w:lang w:val="en-CH" w:eastAsia="en-CH"/>
         </w:rPr>
       </w:pPr>
-      <w:hyperlink w:anchor="_Toc209175217" w:history="1">
+      <w:hyperlink w:anchor="_Toc209624225" w:history="1">
         <w:r>
           <w:rPr>
             <w:rStyle w:val="Hyperlink"/>
             <w:noProof/>
+            <w:sz w:val="22"/>
+            <w:szCs w:val="22"/>
           </w:rPr>
           <w:t>Reset-Knopf</w:t>
         </w:r>
@@ -2556,6 +2878,8 @@
           <w:rPr>
             <w:noProof/>
             <w:webHidden/>
+            <w:sz w:val="22"/>
+            <w:szCs w:val="22"/>
           </w:rPr>
           <w:tab/>
         </w:r>
@@ -2563,6 +2887,8 @@
           <w:rPr>
             <w:noProof/>
             <w:webHidden/>
+            <w:sz w:val="22"/>
+            <w:szCs w:val="22"/>
           </w:rPr>
           <w:fldChar w:fldCharType="begin"/>
         </w:r>
@@ -2570,19 +2896,25 @@
           <w:rPr>
             <w:noProof/>
             <w:webHidden/>
-          </w:rPr>
-          <w:instrText xml:space="preserve"> PAGEREF _Toc209175217 \h </w:instrText>
-        </w:r>
-        <w:r>
-          <w:rPr>
-            <w:noProof/>
-            <w:webHidden/>
-          </w:rPr>
-        </w:r>
-        <w:r>
-          <w:rPr>
-            <w:noProof/>
-            <w:webHidden/>
+            <w:sz w:val="22"/>
+            <w:szCs w:val="22"/>
+          </w:rPr>
+          <w:instrText xml:space="preserve"> PAGEREF _Toc209624225 \h </w:instrText>
+        </w:r>
+        <w:r>
+          <w:rPr>
+            <w:noProof/>
+            <w:webHidden/>
+            <w:sz w:val="22"/>
+            <w:szCs w:val="22"/>
+          </w:rPr>
+        </w:r>
+        <w:r>
+          <w:rPr>
+            <w:noProof/>
+            <w:webHidden/>
+            <w:sz w:val="22"/>
+            <w:szCs w:val="22"/>
           </w:rPr>
           <w:fldChar w:fldCharType="separate"/>
         </w:r>
@@ -2590,6 +2922,8 @@
           <w:rPr>
             <w:noProof/>
             <w:webHidden/>
+            <w:sz w:val="22"/>
+            <w:szCs w:val="22"/>
           </w:rPr>
           <w:t>9</w:t>
         </w:r>
@@ -2597,6 +2931,8 @@
           <w:rPr>
             <w:noProof/>
             <w:webHidden/>
+            <w:sz w:val="22"/>
+            <w:szCs w:val="22"/>
           </w:rPr>
           <w:fldChar w:fldCharType="end"/>
         </w:r>
@@ -2610,53 +2946,61 @@
           <w:tab w:val="right" w:leader="underscore" w:pos="9016"/>
         </w:tabs>
         <w:rPr>
-          <w:rFonts w:eastAsiaTheme="minorEastAsia"/>
+          <w:rFonts w:asciiTheme="minorHAnsi" w:eastAsiaTheme="minorEastAsia" w:hAnsiTheme="minorHAnsi"/>
           <w:b w:val="0"/>
           <w:bCs w:val="0"/>
           <w:noProof/>
-          <w:sz w:val="24"/>
-          <w:szCs w:val="24"/>
+          <w:sz w:val="28"/>
+          <w:szCs w:val="28"/>
           <w:lang w:val="en-CH" w:eastAsia="en-CH"/>
         </w:rPr>
       </w:pPr>
-      <w:hyperlink w:anchor="_Toc209175218" w:history="1">
+      <w:hyperlink w:anchor="_Toc209624226" w:history="1">
         <w:r>
           <w:rPr>
             <w:rStyle w:val="Hyperlink"/>
             <w:noProof/>
+            <w:sz w:val="24"/>
+            <w:szCs w:val="24"/>
           </w:rPr>
           <w:t>6.</w:t>
         </w:r>
         <w:r>
           <w:rPr>
-            <w:rFonts w:eastAsiaTheme="minorEastAsia"/>
+            <w:rFonts w:asciiTheme="minorHAnsi" w:eastAsiaTheme="minorEastAsia" w:hAnsiTheme="minorHAnsi"/>
             <w:b w:val="0"/>
             <w:bCs w:val="0"/>
             <w:noProof/>
+            <w:sz w:val="28"/>
+            <w:szCs w:val="28"/>
+            <w:lang w:val="en-CH" w:eastAsia="en-CH"/>
+          </w:rPr>
+          <w:tab/>
+        </w:r>
+        <w:r>
+          <w:rPr>
+            <w:rStyle w:val="Hyperlink"/>
+            <w:noProof/>
             <w:sz w:val="24"/>
             <w:szCs w:val="24"/>
-            <w:lang w:val="en-CH" w:eastAsia="en-CH"/>
+          </w:rPr>
+          <w:t>Sprachbefehle &amp; Satzzeichen</w:t>
+        </w:r>
+        <w:r>
+          <w:rPr>
+            <w:noProof/>
+            <w:webHidden/>
+            <w:sz w:val="24"/>
+            <w:szCs w:val="24"/>
           </w:rPr>
           <w:tab/>
         </w:r>
         <w:r>
           <w:rPr>
-            <w:rStyle w:val="Hyperlink"/>
-            <w:noProof/>
-          </w:rPr>
-          <w:t>Sprachbefehle &amp; Satzzeichen</w:t>
-        </w:r>
-        <w:r>
-          <w:rPr>
-            <w:noProof/>
-            <w:webHidden/>
-          </w:rPr>
-          <w:tab/>
-        </w:r>
-        <w:r>
-          <w:rPr>
-            <w:noProof/>
-            <w:webHidden/>
+            <w:noProof/>
+            <w:webHidden/>
+            <w:sz w:val="24"/>
+            <w:szCs w:val="24"/>
           </w:rPr>
           <w:fldChar w:fldCharType="begin"/>
         </w:r>
@@ -2664,19 +3008,25 @@
           <w:rPr>
             <w:noProof/>
             <w:webHidden/>
-          </w:rPr>
-          <w:instrText xml:space="preserve"> PAGEREF _Toc209175218 \h </w:instrText>
-        </w:r>
-        <w:r>
-          <w:rPr>
-            <w:noProof/>
-            <w:webHidden/>
-          </w:rPr>
-        </w:r>
-        <w:r>
-          <w:rPr>
-            <w:noProof/>
-            <w:webHidden/>
+            <w:sz w:val="24"/>
+            <w:szCs w:val="24"/>
+          </w:rPr>
+          <w:instrText xml:space="preserve"> PAGEREF _Toc209624226 \h </w:instrText>
+        </w:r>
+        <w:r>
+          <w:rPr>
+            <w:noProof/>
+            <w:webHidden/>
+            <w:sz w:val="24"/>
+            <w:szCs w:val="24"/>
+          </w:rPr>
+        </w:r>
+        <w:r>
+          <w:rPr>
+            <w:noProof/>
+            <w:webHidden/>
+            <w:sz w:val="24"/>
+            <w:szCs w:val="24"/>
           </w:rPr>
           <w:fldChar w:fldCharType="separate"/>
         </w:r>
@@ -2684,6 +3034,8 @@
           <w:rPr>
             <w:noProof/>
             <w:webHidden/>
+            <w:sz w:val="24"/>
+            <w:szCs w:val="24"/>
           </w:rPr>
           <w:t>10</w:t>
         </w:r>
@@ -2691,6 +3043,8 @@
           <w:rPr>
             <w:noProof/>
             <w:webHidden/>
+            <w:sz w:val="24"/>
+            <w:szCs w:val="24"/>
           </w:rPr>
           <w:fldChar w:fldCharType="end"/>
         </w:r>
@@ -2703,18 +3057,20 @@
           <w:tab w:val="right" w:leader="underscore" w:pos="9016"/>
         </w:tabs>
         <w:rPr>
-          <w:rFonts w:eastAsiaTheme="minorEastAsia"/>
+          <w:rFonts w:asciiTheme="minorHAnsi" w:eastAsiaTheme="minorEastAsia" w:hAnsiTheme="minorHAnsi"/>
           <w:noProof/>
-          <w:sz w:val="24"/>
-          <w:szCs w:val="24"/>
+          <w:sz w:val="28"/>
+          <w:szCs w:val="28"/>
           <w:lang w:val="en-CH" w:eastAsia="en-CH"/>
         </w:rPr>
       </w:pPr>
-      <w:hyperlink w:anchor="_Toc209175219" w:history="1">
+      <w:hyperlink w:anchor="_Toc209624227" w:history="1">
         <w:r>
           <w:rPr>
             <w:rStyle w:val="Hyperlink"/>
             <w:noProof/>
+            <w:sz w:val="22"/>
+            <w:szCs w:val="22"/>
           </w:rPr>
           <w:t>Sprachbefehle im Zuhörer Modus</w:t>
         </w:r>
@@ -2722,6 +3078,8 @@
           <w:rPr>
             <w:noProof/>
             <w:webHidden/>
+            <w:sz w:val="22"/>
+            <w:szCs w:val="22"/>
           </w:rPr>
           <w:tab/>
         </w:r>
@@ -2729,6 +3087,8 @@
           <w:rPr>
             <w:noProof/>
             <w:webHidden/>
+            <w:sz w:val="22"/>
+            <w:szCs w:val="22"/>
           </w:rPr>
           <w:fldChar w:fldCharType="begin"/>
         </w:r>
@@ -2736,19 +3096,25 @@
           <w:rPr>
             <w:noProof/>
             <w:webHidden/>
-          </w:rPr>
-          <w:instrText xml:space="preserve"> PAGEREF _Toc209175219 \h </w:instrText>
-        </w:r>
-        <w:r>
-          <w:rPr>
-            <w:noProof/>
-            <w:webHidden/>
-          </w:rPr>
-        </w:r>
-        <w:r>
-          <w:rPr>
-            <w:noProof/>
-            <w:webHidden/>
+            <w:sz w:val="22"/>
+            <w:szCs w:val="22"/>
+          </w:rPr>
+          <w:instrText xml:space="preserve"> PAGEREF _Toc209624227 \h </w:instrText>
+        </w:r>
+        <w:r>
+          <w:rPr>
+            <w:noProof/>
+            <w:webHidden/>
+            <w:sz w:val="22"/>
+            <w:szCs w:val="22"/>
+          </w:rPr>
+        </w:r>
+        <w:r>
+          <w:rPr>
+            <w:noProof/>
+            <w:webHidden/>
+            <w:sz w:val="22"/>
+            <w:szCs w:val="22"/>
           </w:rPr>
           <w:fldChar w:fldCharType="separate"/>
         </w:r>
@@ -2756,6 +3122,8 @@
           <w:rPr>
             <w:noProof/>
             <w:webHidden/>
+            <w:sz w:val="22"/>
+            <w:szCs w:val="22"/>
           </w:rPr>
           <w:t>10</w:t>
         </w:r>
@@ -2763,6 +3131,8 @@
           <w:rPr>
             <w:noProof/>
             <w:webHidden/>
+            <w:sz w:val="22"/>
+            <w:szCs w:val="22"/>
           </w:rPr>
           <w:fldChar w:fldCharType="end"/>
         </w:r>
@@ -2775,18 +3145,20 @@
           <w:tab w:val="right" w:leader="underscore" w:pos="9016"/>
         </w:tabs>
         <w:rPr>
-          <w:rFonts w:eastAsiaTheme="minorEastAsia"/>
+          <w:rFonts w:asciiTheme="minorHAnsi" w:eastAsiaTheme="minorEastAsia" w:hAnsiTheme="minorHAnsi"/>
           <w:noProof/>
-          <w:sz w:val="24"/>
-          <w:szCs w:val="24"/>
+          <w:sz w:val="28"/>
+          <w:szCs w:val="28"/>
           <w:lang w:val="en-CH" w:eastAsia="en-CH"/>
         </w:rPr>
       </w:pPr>
-      <w:hyperlink w:anchor="_Toc209175220" w:history="1">
+      <w:hyperlink w:anchor="_Toc209624228" w:history="1">
         <w:r>
           <w:rPr>
             <w:rStyle w:val="Hyperlink"/>
             <w:noProof/>
+            <w:sz w:val="22"/>
+            <w:szCs w:val="22"/>
           </w:rPr>
           <w:t>Sprachbefehle im Diktatmodus</w:t>
         </w:r>
@@ -2794,6 +3166,8 @@
           <w:rPr>
             <w:noProof/>
             <w:webHidden/>
+            <w:sz w:val="22"/>
+            <w:szCs w:val="22"/>
           </w:rPr>
           <w:tab/>
         </w:r>
@@ -2801,6 +3175,8 @@
           <w:rPr>
             <w:noProof/>
             <w:webHidden/>
+            <w:sz w:val="22"/>
+            <w:szCs w:val="22"/>
           </w:rPr>
           <w:fldChar w:fldCharType="begin"/>
         </w:r>
@@ -2808,19 +3184,25 @@
           <w:rPr>
             <w:noProof/>
             <w:webHidden/>
-          </w:rPr>
-          <w:instrText xml:space="preserve"> PAGEREF _Toc209175220 \h </w:instrText>
-        </w:r>
-        <w:r>
-          <w:rPr>
-            <w:noProof/>
-            <w:webHidden/>
-          </w:rPr>
-        </w:r>
-        <w:r>
-          <w:rPr>
-            <w:noProof/>
-            <w:webHidden/>
+            <w:sz w:val="22"/>
+            <w:szCs w:val="22"/>
+          </w:rPr>
+          <w:instrText xml:space="preserve"> PAGEREF _Toc209624228 \h </w:instrText>
+        </w:r>
+        <w:r>
+          <w:rPr>
+            <w:noProof/>
+            <w:webHidden/>
+            <w:sz w:val="22"/>
+            <w:szCs w:val="22"/>
+          </w:rPr>
+        </w:r>
+        <w:r>
+          <w:rPr>
+            <w:noProof/>
+            <w:webHidden/>
+            <w:sz w:val="22"/>
+            <w:szCs w:val="22"/>
           </w:rPr>
           <w:fldChar w:fldCharType="separate"/>
         </w:r>
@@ -2828,6 +3210,8 @@
           <w:rPr>
             <w:noProof/>
             <w:webHidden/>
+            <w:sz w:val="22"/>
+            <w:szCs w:val="22"/>
           </w:rPr>
           <w:t>10</w:t>
         </w:r>
@@ -2835,6 +3219,8 @@
           <w:rPr>
             <w:noProof/>
             <w:webHidden/>
+            <w:sz w:val="22"/>
+            <w:szCs w:val="22"/>
           </w:rPr>
           <w:fldChar w:fldCharType="end"/>
         </w:r>
@@ -2847,18 +3233,20 @@
           <w:tab w:val="right" w:leader="underscore" w:pos="9016"/>
         </w:tabs>
         <w:rPr>
-          <w:rFonts w:eastAsiaTheme="minorEastAsia"/>
+          <w:rFonts w:asciiTheme="minorHAnsi" w:eastAsiaTheme="minorEastAsia" w:hAnsiTheme="minorHAnsi"/>
           <w:noProof/>
-          <w:sz w:val="24"/>
-          <w:szCs w:val="24"/>
+          <w:sz w:val="28"/>
+          <w:szCs w:val="28"/>
           <w:lang w:val="en-CH" w:eastAsia="en-CH"/>
         </w:rPr>
       </w:pPr>
-      <w:hyperlink w:anchor="_Toc209175221" w:history="1">
+      <w:hyperlink w:anchor="_Toc209624229" w:history="1">
         <w:r>
           <w:rPr>
             <w:rStyle w:val="Hyperlink"/>
             <w:noProof/>
+            <w:sz w:val="22"/>
+            <w:szCs w:val="22"/>
           </w:rPr>
           <w:t>Standartbefehle</w:t>
         </w:r>
@@ -2866,6 +3254,8 @@
           <w:rPr>
             <w:noProof/>
             <w:webHidden/>
+            <w:sz w:val="22"/>
+            <w:szCs w:val="22"/>
           </w:rPr>
           <w:tab/>
         </w:r>
@@ -2873,6 +3263,8 @@
           <w:rPr>
             <w:noProof/>
             <w:webHidden/>
+            <w:sz w:val="22"/>
+            <w:szCs w:val="22"/>
           </w:rPr>
           <w:fldChar w:fldCharType="begin"/>
         </w:r>
@@ -2880,19 +3272,25 @@
           <w:rPr>
             <w:noProof/>
             <w:webHidden/>
-          </w:rPr>
-          <w:instrText xml:space="preserve"> PAGEREF _Toc209175221 \h </w:instrText>
-        </w:r>
-        <w:r>
-          <w:rPr>
-            <w:noProof/>
-            <w:webHidden/>
-          </w:rPr>
-        </w:r>
-        <w:r>
-          <w:rPr>
-            <w:noProof/>
-            <w:webHidden/>
+            <w:sz w:val="22"/>
+            <w:szCs w:val="22"/>
+          </w:rPr>
+          <w:instrText xml:space="preserve"> PAGEREF _Toc209624229 \h </w:instrText>
+        </w:r>
+        <w:r>
+          <w:rPr>
+            <w:noProof/>
+            <w:webHidden/>
+            <w:sz w:val="22"/>
+            <w:szCs w:val="22"/>
+          </w:rPr>
+        </w:r>
+        <w:r>
+          <w:rPr>
+            <w:noProof/>
+            <w:webHidden/>
+            <w:sz w:val="22"/>
+            <w:szCs w:val="22"/>
           </w:rPr>
           <w:fldChar w:fldCharType="separate"/>
         </w:r>
@@ -2900,6 +3298,8 @@
           <w:rPr>
             <w:noProof/>
             <w:webHidden/>
+            <w:sz w:val="22"/>
+            <w:szCs w:val="22"/>
           </w:rPr>
           <w:t>10</w:t>
         </w:r>
@@ -2907,6 +3307,8 @@
           <w:rPr>
             <w:noProof/>
             <w:webHidden/>
+            <w:sz w:val="22"/>
+            <w:szCs w:val="22"/>
           </w:rPr>
           <w:fldChar w:fldCharType="end"/>
         </w:r>
@@ -2919,18 +3321,20 @@
           <w:tab w:val="right" w:leader="underscore" w:pos="9016"/>
         </w:tabs>
         <w:rPr>
-          <w:rFonts w:eastAsiaTheme="minorEastAsia"/>
+          <w:rFonts w:asciiTheme="minorHAnsi" w:eastAsiaTheme="minorEastAsia" w:hAnsiTheme="minorHAnsi"/>
           <w:noProof/>
-          <w:sz w:val="24"/>
-          <w:szCs w:val="24"/>
+          <w:sz w:val="28"/>
+          <w:szCs w:val="28"/>
           <w:lang w:val="en-CH" w:eastAsia="en-CH"/>
         </w:rPr>
       </w:pPr>
-      <w:hyperlink w:anchor="_Toc209175222" w:history="1">
+      <w:hyperlink w:anchor="_Toc209624230" w:history="1">
         <w:r>
           <w:rPr>
             <w:rStyle w:val="Hyperlink"/>
             <w:noProof/>
+            <w:sz w:val="22"/>
+            <w:szCs w:val="22"/>
           </w:rPr>
           <w:t>Benutzerdefinierte Befehle</w:t>
         </w:r>
@@ -2938,6 +3342,8 @@
           <w:rPr>
             <w:noProof/>
             <w:webHidden/>
+            <w:sz w:val="22"/>
+            <w:szCs w:val="22"/>
           </w:rPr>
           <w:tab/>
         </w:r>
@@ -2945,6 +3351,8 @@
           <w:rPr>
             <w:noProof/>
             <w:webHidden/>
+            <w:sz w:val="22"/>
+            <w:szCs w:val="22"/>
           </w:rPr>
           <w:fldChar w:fldCharType="begin"/>
         </w:r>
@@ -2952,19 +3360,25 @@
           <w:rPr>
             <w:noProof/>
             <w:webHidden/>
-          </w:rPr>
-          <w:instrText xml:space="preserve"> PAGEREF _Toc209175222 \h </w:instrText>
-        </w:r>
-        <w:r>
-          <w:rPr>
-            <w:noProof/>
-            <w:webHidden/>
-          </w:rPr>
-        </w:r>
-        <w:r>
-          <w:rPr>
-            <w:noProof/>
-            <w:webHidden/>
+            <w:sz w:val="22"/>
+            <w:szCs w:val="22"/>
+          </w:rPr>
+          <w:instrText xml:space="preserve"> PAGEREF _Toc209624230 \h </w:instrText>
+        </w:r>
+        <w:r>
+          <w:rPr>
+            <w:noProof/>
+            <w:webHidden/>
+            <w:sz w:val="22"/>
+            <w:szCs w:val="22"/>
+          </w:rPr>
+        </w:r>
+        <w:r>
+          <w:rPr>
+            <w:noProof/>
+            <w:webHidden/>
+            <w:sz w:val="22"/>
+            <w:szCs w:val="22"/>
           </w:rPr>
           <w:fldChar w:fldCharType="separate"/>
         </w:r>
@@ -2972,6 +3386,8 @@
           <w:rPr>
             <w:noProof/>
             <w:webHidden/>
+            <w:sz w:val="22"/>
+            <w:szCs w:val="22"/>
           </w:rPr>
           <w:t>10</w:t>
         </w:r>
@@ -2979,6 +3395,8 @@
           <w:rPr>
             <w:noProof/>
             <w:webHidden/>
+            <w:sz w:val="22"/>
+            <w:szCs w:val="22"/>
           </w:rPr>
           <w:fldChar w:fldCharType="end"/>
         </w:r>
@@ -2991,18 +3409,20 @@
           <w:tab w:val="right" w:leader="underscore" w:pos="9016"/>
         </w:tabs>
         <w:rPr>
-          <w:rFonts w:eastAsiaTheme="minorEastAsia"/>
+          <w:rFonts w:asciiTheme="minorHAnsi" w:eastAsiaTheme="minorEastAsia" w:hAnsiTheme="minorHAnsi"/>
           <w:noProof/>
-          <w:sz w:val="24"/>
-          <w:szCs w:val="24"/>
+          <w:sz w:val="28"/>
+          <w:szCs w:val="28"/>
           <w:lang w:val="en-CH" w:eastAsia="en-CH"/>
         </w:rPr>
       </w:pPr>
-      <w:hyperlink w:anchor="_Toc209175223" w:history="1">
+      <w:hyperlink w:anchor="_Toc209624231" w:history="1">
         <w:r>
           <w:rPr>
             <w:rStyle w:val="Hyperlink"/>
             <w:noProof/>
+            <w:sz w:val="22"/>
+            <w:szCs w:val="22"/>
           </w:rPr>
           <w:t>Bearbeiten von Sprachbefehlen.</w:t>
         </w:r>
@@ -3010,6 +3430,8 @@
           <w:rPr>
             <w:noProof/>
             <w:webHidden/>
+            <w:sz w:val="22"/>
+            <w:szCs w:val="22"/>
           </w:rPr>
           <w:tab/>
         </w:r>
@@ -3017,6 +3439,8 @@
           <w:rPr>
             <w:noProof/>
             <w:webHidden/>
+            <w:sz w:val="22"/>
+            <w:szCs w:val="22"/>
           </w:rPr>
           <w:fldChar w:fldCharType="begin"/>
         </w:r>
@@ -3024,19 +3448,25 @@
           <w:rPr>
             <w:noProof/>
             <w:webHidden/>
-          </w:rPr>
-          <w:instrText xml:space="preserve"> PAGEREF _Toc209175223 \h </w:instrText>
-        </w:r>
-        <w:r>
-          <w:rPr>
-            <w:noProof/>
-            <w:webHidden/>
-          </w:rPr>
-        </w:r>
-        <w:r>
-          <w:rPr>
-            <w:noProof/>
-            <w:webHidden/>
+            <w:sz w:val="22"/>
+            <w:szCs w:val="22"/>
+          </w:rPr>
+          <w:instrText xml:space="preserve"> PAGEREF _Toc209624231 \h </w:instrText>
+        </w:r>
+        <w:r>
+          <w:rPr>
+            <w:noProof/>
+            <w:webHidden/>
+            <w:sz w:val="22"/>
+            <w:szCs w:val="22"/>
+          </w:rPr>
+        </w:r>
+        <w:r>
+          <w:rPr>
+            <w:noProof/>
+            <w:webHidden/>
+            <w:sz w:val="22"/>
+            <w:szCs w:val="22"/>
           </w:rPr>
           <w:fldChar w:fldCharType="separate"/>
         </w:r>
@@ -3044,6 +3474,8 @@
           <w:rPr>
             <w:noProof/>
             <w:webHidden/>
+            <w:sz w:val="22"/>
+            <w:szCs w:val="22"/>
           </w:rPr>
           <w:t>10</w:t>
         </w:r>
@@ -3051,6 +3483,8 @@
           <w:rPr>
             <w:noProof/>
             <w:webHidden/>
+            <w:sz w:val="22"/>
+            <w:szCs w:val="22"/>
           </w:rPr>
           <w:fldChar w:fldCharType="end"/>
         </w:r>
@@ -3063,18 +3497,20 @@
           <w:tab w:val="right" w:leader="underscore" w:pos="9016"/>
         </w:tabs>
         <w:rPr>
-          <w:rFonts w:eastAsiaTheme="minorEastAsia"/>
+          <w:rFonts w:asciiTheme="minorHAnsi" w:eastAsiaTheme="minorEastAsia" w:hAnsiTheme="minorHAnsi"/>
           <w:noProof/>
-          <w:sz w:val="24"/>
-          <w:szCs w:val="24"/>
+          <w:sz w:val="28"/>
+          <w:szCs w:val="28"/>
           <w:lang w:val="en-CH" w:eastAsia="en-CH"/>
         </w:rPr>
       </w:pPr>
-      <w:hyperlink w:anchor="_Toc209175224" w:history="1">
+      <w:hyperlink w:anchor="_Toc209624232" w:history="1">
         <w:r>
           <w:rPr>
             <w:rStyle w:val="Hyperlink"/>
             <w:noProof/>
+            <w:sz w:val="22"/>
+            <w:szCs w:val="22"/>
           </w:rPr>
           <w:t>Wo finde ich die «keywords.xml» Datei?</w:t>
         </w:r>
@@ -3082,6 +3518,8 @@
           <w:rPr>
             <w:noProof/>
             <w:webHidden/>
+            <w:sz w:val="22"/>
+            <w:szCs w:val="22"/>
           </w:rPr>
           <w:tab/>
         </w:r>
@@ -3089,6 +3527,8 @@
           <w:rPr>
             <w:noProof/>
             <w:webHidden/>
+            <w:sz w:val="22"/>
+            <w:szCs w:val="22"/>
           </w:rPr>
           <w:fldChar w:fldCharType="begin"/>
         </w:r>
@@ -3096,19 +3536,25 @@
           <w:rPr>
             <w:noProof/>
             <w:webHidden/>
-          </w:rPr>
-          <w:instrText xml:space="preserve"> PAGEREF _Toc209175224 \h </w:instrText>
-        </w:r>
-        <w:r>
-          <w:rPr>
-            <w:noProof/>
-            <w:webHidden/>
-          </w:rPr>
-        </w:r>
-        <w:r>
-          <w:rPr>
-            <w:noProof/>
-            <w:webHidden/>
+            <w:sz w:val="22"/>
+            <w:szCs w:val="22"/>
+          </w:rPr>
+          <w:instrText xml:space="preserve"> PAGEREF _Toc209624232 \h </w:instrText>
+        </w:r>
+        <w:r>
+          <w:rPr>
+            <w:noProof/>
+            <w:webHidden/>
+            <w:sz w:val="22"/>
+            <w:szCs w:val="22"/>
+          </w:rPr>
+        </w:r>
+        <w:r>
+          <w:rPr>
+            <w:noProof/>
+            <w:webHidden/>
+            <w:sz w:val="22"/>
+            <w:szCs w:val="22"/>
           </w:rPr>
           <w:fldChar w:fldCharType="separate"/>
         </w:r>
@@ -3116,6 +3562,8 @@
           <w:rPr>
             <w:noProof/>
             <w:webHidden/>
+            <w:sz w:val="22"/>
+            <w:szCs w:val="22"/>
           </w:rPr>
           <w:t>10</w:t>
         </w:r>
@@ -3123,6 +3571,8 @@
           <w:rPr>
             <w:noProof/>
             <w:webHidden/>
+            <w:sz w:val="22"/>
+            <w:szCs w:val="22"/>
           </w:rPr>
           <w:fldChar w:fldCharType="end"/>
         </w:r>
@@ -3135,18 +3585,20 @@
           <w:tab w:val="right" w:leader="underscore" w:pos="9016"/>
         </w:tabs>
         <w:rPr>
-          <w:rFonts w:eastAsiaTheme="minorEastAsia"/>
+          <w:rFonts w:asciiTheme="minorHAnsi" w:eastAsiaTheme="minorEastAsia" w:hAnsiTheme="minorHAnsi"/>
           <w:noProof/>
-          <w:sz w:val="24"/>
-          <w:szCs w:val="24"/>
+          <w:sz w:val="28"/>
+          <w:szCs w:val="28"/>
           <w:lang w:val="en-CH" w:eastAsia="en-CH"/>
         </w:rPr>
       </w:pPr>
-      <w:hyperlink w:anchor="_Toc209175225" w:history="1">
+      <w:hyperlink w:anchor="_Toc209624233" w:history="1">
         <w:r>
           <w:rPr>
             <w:rStyle w:val="Hyperlink"/>
             <w:noProof/>
+            <w:sz w:val="22"/>
+            <w:szCs w:val="22"/>
           </w:rPr>
           <w:t>Wie ist die Datei aufgebaut?</w:t>
         </w:r>
@@ -3154,6 +3606,8 @@
           <w:rPr>
             <w:noProof/>
             <w:webHidden/>
+            <w:sz w:val="22"/>
+            <w:szCs w:val="22"/>
           </w:rPr>
           <w:tab/>
         </w:r>
@@ -3161,6 +3615,8 @@
           <w:rPr>
             <w:noProof/>
             <w:webHidden/>
+            <w:sz w:val="22"/>
+            <w:szCs w:val="22"/>
           </w:rPr>
           <w:fldChar w:fldCharType="begin"/>
         </w:r>
@@ -3168,19 +3624,25 @@
           <w:rPr>
             <w:noProof/>
             <w:webHidden/>
-          </w:rPr>
-          <w:instrText xml:space="preserve"> PAGEREF _Toc209175225 \h </w:instrText>
-        </w:r>
-        <w:r>
-          <w:rPr>
-            <w:noProof/>
-            <w:webHidden/>
-          </w:rPr>
-        </w:r>
-        <w:r>
-          <w:rPr>
-            <w:noProof/>
-            <w:webHidden/>
+            <w:sz w:val="22"/>
+            <w:szCs w:val="22"/>
+          </w:rPr>
+          <w:instrText xml:space="preserve"> PAGEREF _Toc209624233 \h </w:instrText>
+        </w:r>
+        <w:r>
+          <w:rPr>
+            <w:noProof/>
+            <w:webHidden/>
+            <w:sz w:val="22"/>
+            <w:szCs w:val="22"/>
+          </w:rPr>
+        </w:r>
+        <w:r>
+          <w:rPr>
+            <w:noProof/>
+            <w:webHidden/>
+            <w:sz w:val="22"/>
+            <w:szCs w:val="22"/>
           </w:rPr>
           <w:fldChar w:fldCharType="separate"/>
         </w:r>
@@ -3188,6 +3650,8 @@
           <w:rPr>
             <w:noProof/>
             <w:webHidden/>
+            <w:sz w:val="22"/>
+            <w:szCs w:val="22"/>
           </w:rPr>
           <w:t>11</w:t>
         </w:r>
@@ -3195,6 +3659,8 @@
           <w:rPr>
             <w:noProof/>
             <w:webHidden/>
+            <w:sz w:val="22"/>
+            <w:szCs w:val="22"/>
           </w:rPr>
           <w:fldChar w:fldCharType="end"/>
         </w:r>
@@ -3207,18 +3673,20 @@
           <w:tab w:val="right" w:leader="underscore" w:pos="9016"/>
         </w:tabs>
         <w:rPr>
-          <w:rFonts w:eastAsiaTheme="minorEastAsia"/>
+          <w:rFonts w:asciiTheme="minorHAnsi" w:eastAsiaTheme="minorEastAsia" w:hAnsiTheme="minorHAnsi"/>
           <w:noProof/>
-          <w:sz w:val="24"/>
-          <w:szCs w:val="24"/>
+          <w:sz w:val="28"/>
+          <w:szCs w:val="28"/>
           <w:lang w:val="en-CH" w:eastAsia="en-CH"/>
         </w:rPr>
       </w:pPr>
-      <w:hyperlink w:anchor="_Toc209175226" w:history="1">
+      <w:hyperlink w:anchor="_Toc209624234" w:history="1">
         <w:r>
           <w:rPr>
             <w:rStyle w:val="Hyperlink"/>
             <w:noProof/>
+            <w:sz w:val="22"/>
+            <w:szCs w:val="22"/>
           </w:rPr>
           <w:t>Wie kann ich die Datei bearbeiten?</w:t>
         </w:r>
@@ -3226,6 +3694,8 @@
           <w:rPr>
             <w:noProof/>
             <w:webHidden/>
+            <w:sz w:val="22"/>
+            <w:szCs w:val="22"/>
           </w:rPr>
           <w:tab/>
         </w:r>
@@ -3233,6 +3703,8 @@
           <w:rPr>
             <w:noProof/>
             <w:webHidden/>
+            <w:sz w:val="22"/>
+            <w:szCs w:val="22"/>
           </w:rPr>
           <w:fldChar w:fldCharType="begin"/>
         </w:r>
@@ -3240,19 +3712,25 @@
           <w:rPr>
             <w:noProof/>
             <w:webHidden/>
-          </w:rPr>
-          <w:instrText xml:space="preserve"> PAGEREF _Toc209175226 \h </w:instrText>
-        </w:r>
-        <w:r>
-          <w:rPr>
-            <w:noProof/>
-            <w:webHidden/>
-          </w:rPr>
-        </w:r>
-        <w:r>
-          <w:rPr>
-            <w:noProof/>
-            <w:webHidden/>
+            <w:sz w:val="22"/>
+            <w:szCs w:val="22"/>
+          </w:rPr>
+          <w:instrText xml:space="preserve"> PAGEREF _Toc209624234 \h </w:instrText>
+        </w:r>
+        <w:r>
+          <w:rPr>
+            <w:noProof/>
+            <w:webHidden/>
+            <w:sz w:val="22"/>
+            <w:szCs w:val="22"/>
+          </w:rPr>
+        </w:r>
+        <w:r>
+          <w:rPr>
+            <w:noProof/>
+            <w:webHidden/>
+            <w:sz w:val="22"/>
+            <w:szCs w:val="22"/>
           </w:rPr>
           <w:fldChar w:fldCharType="separate"/>
         </w:r>
@@ -3260,6 +3738,8 @@
           <w:rPr>
             <w:noProof/>
             <w:webHidden/>
+            <w:sz w:val="22"/>
+            <w:szCs w:val="22"/>
           </w:rPr>
           <w:t>11</w:t>
         </w:r>
@@ -3267,6 +3747,8 @@
           <w:rPr>
             <w:noProof/>
             <w:webHidden/>
+            <w:sz w:val="22"/>
+            <w:szCs w:val="22"/>
           </w:rPr>
           <w:fldChar w:fldCharType="end"/>
         </w:r>
@@ -3279,18 +3761,20 @@
           <w:tab w:val="right" w:leader="underscore" w:pos="9016"/>
         </w:tabs>
         <w:rPr>
-          <w:rFonts w:eastAsiaTheme="minorEastAsia"/>
+          <w:rFonts w:asciiTheme="minorHAnsi" w:eastAsiaTheme="minorEastAsia" w:hAnsiTheme="minorHAnsi"/>
           <w:noProof/>
-          <w:sz w:val="24"/>
-          <w:szCs w:val="24"/>
+          <w:sz w:val="28"/>
+          <w:szCs w:val="28"/>
           <w:lang w:val="en-CH" w:eastAsia="en-CH"/>
         </w:rPr>
       </w:pPr>
-      <w:hyperlink w:anchor="_Toc209175227" w:history="1">
+      <w:hyperlink w:anchor="_Toc209624235" w:history="1">
         <w:r>
           <w:rPr>
             <w:rStyle w:val="Hyperlink"/>
             <w:noProof/>
+            <w:sz w:val="22"/>
+            <w:szCs w:val="22"/>
           </w:rPr>
           <w:t>Einschränkungen:</w:t>
         </w:r>
@@ -3298,6 +3782,8 @@
           <w:rPr>
             <w:noProof/>
             <w:webHidden/>
+            <w:sz w:val="22"/>
+            <w:szCs w:val="22"/>
           </w:rPr>
           <w:tab/>
         </w:r>
@@ -3305,6 +3791,8 @@
           <w:rPr>
             <w:noProof/>
             <w:webHidden/>
+            <w:sz w:val="22"/>
+            <w:szCs w:val="22"/>
           </w:rPr>
           <w:fldChar w:fldCharType="begin"/>
         </w:r>
@@ -3312,19 +3800,25 @@
           <w:rPr>
             <w:noProof/>
             <w:webHidden/>
-          </w:rPr>
-          <w:instrText xml:space="preserve"> PAGEREF _Toc209175227 \h </w:instrText>
-        </w:r>
-        <w:r>
-          <w:rPr>
-            <w:noProof/>
-            <w:webHidden/>
-          </w:rPr>
-        </w:r>
-        <w:r>
-          <w:rPr>
-            <w:noProof/>
-            <w:webHidden/>
+            <w:sz w:val="22"/>
+            <w:szCs w:val="22"/>
+          </w:rPr>
+          <w:instrText xml:space="preserve"> PAGEREF _Toc209624235 \h </w:instrText>
+        </w:r>
+        <w:r>
+          <w:rPr>
+            <w:noProof/>
+            <w:webHidden/>
+            <w:sz w:val="22"/>
+            <w:szCs w:val="22"/>
+          </w:rPr>
+        </w:r>
+        <w:r>
+          <w:rPr>
+            <w:noProof/>
+            <w:webHidden/>
+            <w:sz w:val="22"/>
+            <w:szCs w:val="22"/>
           </w:rPr>
           <w:fldChar w:fldCharType="separate"/>
         </w:r>
@@ -3332,13 +3826,17 @@
           <w:rPr>
             <w:noProof/>
             <w:webHidden/>
-          </w:rPr>
-          <w:t>11</w:t>
-        </w:r>
-        <w:r>
-          <w:rPr>
-            <w:noProof/>
-            <w:webHidden/>
+            <w:sz w:val="22"/>
+            <w:szCs w:val="22"/>
+          </w:rPr>
+          <w:t>12</w:t>
+        </w:r>
+        <w:r>
+          <w:rPr>
+            <w:noProof/>
+            <w:webHidden/>
+            <w:sz w:val="22"/>
+            <w:szCs w:val="22"/>
           </w:rPr>
           <w:fldChar w:fldCharType="end"/>
         </w:r>
@@ -3352,53 +3850,61 @@
           <w:tab w:val="right" w:leader="underscore" w:pos="9016"/>
         </w:tabs>
         <w:rPr>
-          <w:rFonts w:eastAsiaTheme="minorEastAsia"/>
+          <w:rFonts w:asciiTheme="minorHAnsi" w:eastAsiaTheme="minorEastAsia" w:hAnsiTheme="minorHAnsi"/>
           <w:b w:val="0"/>
           <w:bCs w:val="0"/>
           <w:noProof/>
-          <w:sz w:val="24"/>
-          <w:szCs w:val="24"/>
+          <w:sz w:val="28"/>
+          <w:szCs w:val="28"/>
           <w:lang w:val="en-CH" w:eastAsia="en-CH"/>
         </w:rPr>
       </w:pPr>
-      <w:hyperlink w:anchor="_Toc209175228" w:history="1">
+      <w:hyperlink w:anchor="_Toc209624236" w:history="1">
         <w:r>
           <w:rPr>
             <w:rStyle w:val="Hyperlink"/>
             <w:noProof/>
+            <w:sz w:val="24"/>
+            <w:szCs w:val="24"/>
           </w:rPr>
           <w:t>7.</w:t>
         </w:r>
         <w:r>
           <w:rPr>
-            <w:rFonts w:eastAsiaTheme="minorEastAsia"/>
+            <w:rFonts w:asciiTheme="minorHAnsi" w:eastAsiaTheme="minorEastAsia" w:hAnsiTheme="minorHAnsi"/>
             <w:b w:val="0"/>
             <w:bCs w:val="0"/>
             <w:noProof/>
+            <w:sz w:val="28"/>
+            <w:szCs w:val="28"/>
+            <w:lang w:val="en-CH" w:eastAsia="en-CH"/>
+          </w:rPr>
+          <w:tab/>
+        </w:r>
+        <w:r>
+          <w:rPr>
+            <w:rStyle w:val="Hyperlink"/>
+            <w:noProof/>
             <w:sz w:val="24"/>
             <w:szCs w:val="24"/>
-            <w:lang w:val="en-CH" w:eastAsia="en-CH"/>
+          </w:rPr>
+          <w:t>Troubleshooting</w:t>
+        </w:r>
+        <w:r>
+          <w:rPr>
+            <w:noProof/>
+            <w:webHidden/>
+            <w:sz w:val="24"/>
+            <w:szCs w:val="24"/>
           </w:rPr>
           <w:tab/>
         </w:r>
         <w:r>
           <w:rPr>
-            <w:rStyle w:val="Hyperlink"/>
-            <w:noProof/>
-          </w:rPr>
-          <w:t>Troubleshooting</w:t>
-        </w:r>
-        <w:r>
-          <w:rPr>
-            <w:noProof/>
-            <w:webHidden/>
-          </w:rPr>
-          <w:tab/>
-        </w:r>
-        <w:r>
-          <w:rPr>
-            <w:noProof/>
-            <w:webHidden/>
+            <w:noProof/>
+            <w:webHidden/>
+            <w:sz w:val="24"/>
+            <w:szCs w:val="24"/>
           </w:rPr>
           <w:fldChar w:fldCharType="begin"/>
         </w:r>
@@ -3406,19 +3912,25 @@
           <w:rPr>
             <w:noProof/>
             <w:webHidden/>
-          </w:rPr>
-          <w:instrText xml:space="preserve"> PAGEREF _Toc209175228 \h </w:instrText>
-        </w:r>
-        <w:r>
-          <w:rPr>
-            <w:noProof/>
-            <w:webHidden/>
-          </w:rPr>
-        </w:r>
-        <w:r>
-          <w:rPr>
-            <w:noProof/>
-            <w:webHidden/>
+            <w:sz w:val="24"/>
+            <w:szCs w:val="24"/>
+          </w:rPr>
+          <w:instrText xml:space="preserve"> PAGEREF _Toc209624236 \h </w:instrText>
+        </w:r>
+        <w:r>
+          <w:rPr>
+            <w:noProof/>
+            <w:webHidden/>
+            <w:sz w:val="24"/>
+            <w:szCs w:val="24"/>
+          </w:rPr>
+        </w:r>
+        <w:r>
+          <w:rPr>
+            <w:noProof/>
+            <w:webHidden/>
+            <w:sz w:val="24"/>
+            <w:szCs w:val="24"/>
           </w:rPr>
           <w:fldChar w:fldCharType="separate"/>
         </w:r>
@@ -3426,6 +3938,8 @@
           <w:rPr>
             <w:noProof/>
             <w:webHidden/>
+            <w:sz w:val="24"/>
+            <w:szCs w:val="24"/>
           </w:rPr>
           <w:t>12</w:t>
         </w:r>
@@ -3433,6 +3947,8 @@
           <w:rPr>
             <w:noProof/>
             <w:webHidden/>
+            <w:sz w:val="24"/>
+            <w:szCs w:val="24"/>
           </w:rPr>
           <w:fldChar w:fldCharType="end"/>
         </w:r>
@@ -3445,18 +3961,20 @@
           <w:tab w:val="right" w:leader="underscore" w:pos="9016"/>
         </w:tabs>
         <w:rPr>
-          <w:rFonts w:eastAsiaTheme="minorEastAsia"/>
+          <w:rFonts w:asciiTheme="minorHAnsi" w:eastAsiaTheme="minorEastAsia" w:hAnsiTheme="minorHAnsi"/>
           <w:noProof/>
-          <w:sz w:val="24"/>
-          <w:szCs w:val="24"/>
+          <w:sz w:val="28"/>
+          <w:szCs w:val="28"/>
           <w:lang w:val="en-CH" w:eastAsia="en-CH"/>
         </w:rPr>
       </w:pPr>
-      <w:hyperlink w:anchor="_Toc209175229" w:history="1">
+      <w:hyperlink w:anchor="_Toc209624237" w:history="1">
         <w:r>
           <w:rPr>
             <w:rStyle w:val="Hyperlink"/>
             <w:noProof/>
+            <w:sz w:val="22"/>
+            <w:szCs w:val="22"/>
           </w:rPr>
           <w:t>Ich kann die Menüleiste des Add-Ins nicht sehen.</w:t>
         </w:r>
@@ -3464,6 +3982,8 @@
           <w:rPr>
             <w:noProof/>
             <w:webHidden/>
+            <w:sz w:val="22"/>
+            <w:szCs w:val="22"/>
           </w:rPr>
           <w:tab/>
         </w:r>
@@ -3471,6 +3991,8 @@
           <w:rPr>
             <w:noProof/>
             <w:webHidden/>
+            <w:sz w:val="22"/>
+            <w:szCs w:val="22"/>
           </w:rPr>
           <w:fldChar w:fldCharType="begin"/>
         </w:r>
@@ -3478,19 +4000,25 @@
           <w:rPr>
             <w:noProof/>
             <w:webHidden/>
-          </w:rPr>
-          <w:instrText xml:space="preserve"> PAGEREF _Toc209175229 \h </w:instrText>
-        </w:r>
-        <w:r>
-          <w:rPr>
-            <w:noProof/>
-            <w:webHidden/>
-          </w:rPr>
-        </w:r>
-        <w:r>
-          <w:rPr>
-            <w:noProof/>
-            <w:webHidden/>
+            <w:sz w:val="22"/>
+            <w:szCs w:val="22"/>
+          </w:rPr>
+          <w:instrText xml:space="preserve"> PAGEREF _Toc209624237 \h </w:instrText>
+        </w:r>
+        <w:r>
+          <w:rPr>
+            <w:noProof/>
+            <w:webHidden/>
+            <w:sz w:val="22"/>
+            <w:szCs w:val="22"/>
+          </w:rPr>
+        </w:r>
+        <w:r>
+          <w:rPr>
+            <w:noProof/>
+            <w:webHidden/>
+            <w:sz w:val="22"/>
+            <w:szCs w:val="22"/>
           </w:rPr>
           <w:fldChar w:fldCharType="separate"/>
         </w:r>
@@ -3498,6 +4026,8 @@
           <w:rPr>
             <w:noProof/>
             <w:webHidden/>
+            <w:sz w:val="22"/>
+            <w:szCs w:val="22"/>
           </w:rPr>
           <w:t>12</w:t>
         </w:r>
@@ -3505,6 +4035,8 @@
           <w:rPr>
             <w:noProof/>
             <w:webHidden/>
+            <w:sz w:val="22"/>
+            <w:szCs w:val="22"/>
           </w:rPr>
           <w:fldChar w:fldCharType="end"/>
         </w:r>
@@ -3517,18 +4049,20 @@
           <w:tab w:val="right" w:leader="underscore" w:pos="9016"/>
         </w:tabs>
         <w:rPr>
-          <w:rFonts w:eastAsiaTheme="minorEastAsia"/>
+          <w:rFonts w:asciiTheme="minorHAnsi" w:eastAsiaTheme="minorEastAsia" w:hAnsiTheme="minorHAnsi"/>
           <w:noProof/>
-          <w:sz w:val="24"/>
-          <w:szCs w:val="24"/>
+          <w:sz w:val="28"/>
+          <w:szCs w:val="28"/>
           <w:lang w:val="en-CH" w:eastAsia="en-CH"/>
         </w:rPr>
       </w:pPr>
-      <w:hyperlink w:anchor="_Toc209175230" w:history="1">
+      <w:hyperlink w:anchor="_Toc209624238" w:history="1">
         <w:r>
           <w:rPr>
             <w:rStyle w:val="Hyperlink"/>
             <w:noProof/>
+            <w:sz w:val="22"/>
+            <w:szCs w:val="22"/>
           </w:rPr>
           <w:t>Nach dem Starten der Transkription, stürzt Word ab.</w:t>
         </w:r>
@@ -3536,6 +4070,8 @@
           <w:rPr>
             <w:noProof/>
             <w:webHidden/>
+            <w:sz w:val="22"/>
+            <w:szCs w:val="22"/>
           </w:rPr>
           <w:tab/>
         </w:r>
@@ -3543,6 +4079,8 @@
           <w:rPr>
             <w:noProof/>
             <w:webHidden/>
+            <w:sz w:val="22"/>
+            <w:szCs w:val="22"/>
           </w:rPr>
           <w:fldChar w:fldCharType="begin"/>
         </w:r>
@@ -3550,19 +4088,25 @@
           <w:rPr>
             <w:noProof/>
             <w:webHidden/>
-          </w:rPr>
-          <w:instrText xml:space="preserve"> PAGEREF _Toc209175230 \h </w:instrText>
-        </w:r>
-        <w:r>
-          <w:rPr>
-            <w:noProof/>
-            <w:webHidden/>
-          </w:rPr>
-        </w:r>
-        <w:r>
-          <w:rPr>
-            <w:noProof/>
-            <w:webHidden/>
+            <w:sz w:val="22"/>
+            <w:szCs w:val="22"/>
+          </w:rPr>
+          <w:instrText xml:space="preserve"> PAGEREF _Toc209624238 \h </w:instrText>
+        </w:r>
+        <w:r>
+          <w:rPr>
+            <w:noProof/>
+            <w:webHidden/>
+            <w:sz w:val="22"/>
+            <w:szCs w:val="22"/>
+          </w:rPr>
+        </w:r>
+        <w:r>
+          <w:rPr>
+            <w:noProof/>
+            <w:webHidden/>
+            <w:sz w:val="22"/>
+            <w:szCs w:val="22"/>
           </w:rPr>
           <w:fldChar w:fldCharType="separate"/>
         </w:r>
@@ -3570,6 +4114,8 @@
           <w:rPr>
             <w:noProof/>
             <w:webHidden/>
+            <w:sz w:val="22"/>
+            <w:szCs w:val="22"/>
           </w:rPr>
           <w:t>12</w:t>
         </w:r>
@@ -3577,6 +4123,8 @@
           <w:rPr>
             <w:noProof/>
             <w:webHidden/>
+            <w:sz w:val="22"/>
+            <w:szCs w:val="22"/>
           </w:rPr>
           <w:fldChar w:fldCharType="end"/>
         </w:r>
@@ -3589,18 +4137,20 @@
           <w:tab w:val="right" w:leader="underscore" w:pos="9016"/>
         </w:tabs>
         <w:rPr>
-          <w:rFonts w:eastAsiaTheme="minorEastAsia"/>
+          <w:rFonts w:asciiTheme="minorHAnsi" w:eastAsiaTheme="minorEastAsia" w:hAnsiTheme="minorHAnsi"/>
           <w:noProof/>
-          <w:sz w:val="24"/>
-          <w:szCs w:val="24"/>
+          <w:sz w:val="28"/>
+          <w:szCs w:val="28"/>
           <w:lang w:val="en-CH" w:eastAsia="en-CH"/>
         </w:rPr>
       </w:pPr>
-      <w:hyperlink w:anchor="_Toc209175231" w:history="1">
+      <w:hyperlink w:anchor="_Toc209624239" w:history="1">
         <w:r>
           <w:rPr>
             <w:rStyle w:val="Hyperlink"/>
             <w:noProof/>
+            <w:sz w:val="22"/>
+            <w:szCs w:val="22"/>
           </w:rPr>
           <w:t>Word stürzt ab, kaum wurde auf den Diktat Knopf gedrückt.</w:t>
         </w:r>
@@ -3608,6 +4158,8 @@
           <w:rPr>
             <w:noProof/>
             <w:webHidden/>
+            <w:sz w:val="22"/>
+            <w:szCs w:val="22"/>
           </w:rPr>
           <w:tab/>
         </w:r>
@@ -3615,6 +4167,8 @@
           <w:rPr>
             <w:noProof/>
             <w:webHidden/>
+            <w:sz w:val="22"/>
+            <w:szCs w:val="22"/>
           </w:rPr>
           <w:fldChar w:fldCharType="begin"/>
         </w:r>
@@ -3622,19 +4176,25 @@
           <w:rPr>
             <w:noProof/>
             <w:webHidden/>
-          </w:rPr>
-          <w:instrText xml:space="preserve"> PAGEREF _Toc209175231 \h </w:instrText>
-        </w:r>
-        <w:r>
-          <w:rPr>
-            <w:noProof/>
-            <w:webHidden/>
-          </w:rPr>
-        </w:r>
-        <w:r>
-          <w:rPr>
-            <w:noProof/>
-            <w:webHidden/>
+            <w:sz w:val="22"/>
+            <w:szCs w:val="22"/>
+          </w:rPr>
+          <w:instrText xml:space="preserve"> PAGEREF _Toc209624239 \h </w:instrText>
+        </w:r>
+        <w:r>
+          <w:rPr>
+            <w:noProof/>
+            <w:webHidden/>
+            <w:sz w:val="22"/>
+            <w:szCs w:val="22"/>
+          </w:rPr>
+        </w:r>
+        <w:r>
+          <w:rPr>
+            <w:noProof/>
+            <w:webHidden/>
+            <w:sz w:val="22"/>
+            <w:szCs w:val="22"/>
           </w:rPr>
           <w:fldChar w:fldCharType="separate"/>
         </w:r>
@@ -3642,6 +4202,8 @@
           <w:rPr>
             <w:noProof/>
             <w:webHidden/>
+            <w:sz w:val="22"/>
+            <w:szCs w:val="22"/>
           </w:rPr>
           <w:t>12</w:t>
         </w:r>
@@ -3649,6 +4211,8 @@
           <w:rPr>
             <w:noProof/>
             <w:webHidden/>
+            <w:sz w:val="22"/>
+            <w:szCs w:val="22"/>
           </w:rPr>
           <w:fldChar w:fldCharType="end"/>
         </w:r>
@@ -3661,25 +4225,29 @@
           <w:tab w:val="right" w:leader="underscore" w:pos="9016"/>
         </w:tabs>
         <w:rPr>
-          <w:rFonts w:eastAsiaTheme="minorEastAsia"/>
+          <w:rFonts w:asciiTheme="minorHAnsi" w:eastAsiaTheme="minorEastAsia" w:hAnsiTheme="minorHAnsi"/>
           <w:noProof/>
-          <w:sz w:val="24"/>
-          <w:szCs w:val="24"/>
+          <w:sz w:val="28"/>
+          <w:szCs w:val="28"/>
           <w:lang w:val="en-CH" w:eastAsia="en-CH"/>
         </w:rPr>
       </w:pPr>
-      <w:hyperlink w:anchor="_Toc209175232" w:history="1">
+      <w:hyperlink w:anchor="_Toc209624240" w:history="1">
         <w:r>
           <w:rPr>
             <w:rStyle w:val="Hyperlink"/>
             <w:noProof/>
-          </w:rPr>
-          <w:t>Es dauert eine Weile, und der Computer fährt zu Höchstleistungen auf, bevor Word abstürzt.</w:t>
-        </w:r>
-        <w:r>
-          <w:rPr>
-            <w:noProof/>
-            <w:webHidden/>
+            <w:sz w:val="22"/>
+            <w:szCs w:val="22"/>
+          </w:rPr>
+          <w:t>Es dauert eine Weile, und der Computer ist ausgelastet, bevor Word abstürzt.</w:t>
+        </w:r>
+        <w:r>
+          <w:rPr>
+            <w:noProof/>
+            <w:webHidden/>
+            <w:sz w:val="22"/>
+            <w:szCs w:val="22"/>
           </w:rPr>
           <w:tab/>
         </w:r>
@@ -3687,6 +4255,8 @@
           <w:rPr>
             <w:noProof/>
             <w:webHidden/>
+            <w:sz w:val="22"/>
+            <w:szCs w:val="22"/>
           </w:rPr>
           <w:fldChar w:fldCharType="begin"/>
         </w:r>
@@ -3694,19 +4264,25 @@
           <w:rPr>
             <w:noProof/>
             <w:webHidden/>
-          </w:rPr>
-          <w:instrText xml:space="preserve"> PAGEREF _Toc209175232 \h </w:instrText>
-        </w:r>
-        <w:r>
-          <w:rPr>
-            <w:noProof/>
-            <w:webHidden/>
-          </w:rPr>
-        </w:r>
-        <w:r>
-          <w:rPr>
-            <w:noProof/>
-            <w:webHidden/>
+            <w:sz w:val="22"/>
+            <w:szCs w:val="22"/>
+          </w:rPr>
+          <w:instrText xml:space="preserve"> PAGEREF _Toc209624240 \h </w:instrText>
+        </w:r>
+        <w:r>
+          <w:rPr>
+            <w:noProof/>
+            <w:webHidden/>
+            <w:sz w:val="22"/>
+            <w:szCs w:val="22"/>
+          </w:rPr>
+        </w:r>
+        <w:r>
+          <w:rPr>
+            <w:noProof/>
+            <w:webHidden/>
+            <w:sz w:val="22"/>
+            <w:szCs w:val="22"/>
           </w:rPr>
           <w:fldChar w:fldCharType="separate"/>
         </w:r>
@@ -3714,6 +4290,8 @@
           <w:rPr>
             <w:noProof/>
             <w:webHidden/>
+            <w:sz w:val="22"/>
+            <w:szCs w:val="22"/>
           </w:rPr>
           <w:t>12</w:t>
         </w:r>
@@ -3721,6 +4299,8 @@
           <w:rPr>
             <w:noProof/>
             <w:webHidden/>
+            <w:sz w:val="22"/>
+            <w:szCs w:val="22"/>
           </w:rPr>
           <w:fldChar w:fldCharType="end"/>
         </w:r>
@@ -3733,18 +4313,20 @@
           <w:tab w:val="right" w:leader="underscore" w:pos="9016"/>
         </w:tabs>
         <w:rPr>
-          <w:rFonts w:eastAsiaTheme="minorEastAsia"/>
+          <w:rFonts w:asciiTheme="minorHAnsi" w:eastAsiaTheme="minorEastAsia" w:hAnsiTheme="minorHAnsi"/>
           <w:noProof/>
-          <w:sz w:val="24"/>
-          <w:szCs w:val="24"/>
+          <w:sz w:val="28"/>
+          <w:szCs w:val="28"/>
           <w:lang w:val="en-CH" w:eastAsia="en-CH"/>
         </w:rPr>
       </w:pPr>
-      <w:hyperlink w:anchor="_Toc209175233" w:history="1">
+      <w:hyperlink w:anchor="_Toc209624241" w:history="1">
         <w:r>
           <w:rPr>
             <w:rStyle w:val="Hyperlink"/>
             <w:noProof/>
+            <w:sz w:val="22"/>
+            <w:szCs w:val="22"/>
           </w:rPr>
           <w:t>Die Transkription ist fehlerhaft</w:t>
         </w:r>
@@ -3752,6 +4334,8 @@
           <w:rPr>
             <w:noProof/>
             <w:webHidden/>
+            <w:sz w:val="22"/>
+            <w:szCs w:val="22"/>
           </w:rPr>
           <w:tab/>
         </w:r>
@@ -3759,6 +4343,8 @@
           <w:rPr>
             <w:noProof/>
             <w:webHidden/>
+            <w:sz w:val="22"/>
+            <w:szCs w:val="22"/>
           </w:rPr>
           <w:fldChar w:fldCharType="begin"/>
         </w:r>
@@ -3766,19 +4352,25 @@
           <w:rPr>
             <w:noProof/>
             <w:webHidden/>
-          </w:rPr>
-          <w:instrText xml:space="preserve"> PAGEREF _Toc209175233 \h </w:instrText>
-        </w:r>
-        <w:r>
-          <w:rPr>
-            <w:noProof/>
-            <w:webHidden/>
-          </w:rPr>
-        </w:r>
-        <w:r>
-          <w:rPr>
-            <w:noProof/>
-            <w:webHidden/>
+            <w:sz w:val="22"/>
+            <w:szCs w:val="22"/>
+          </w:rPr>
+          <w:instrText xml:space="preserve"> PAGEREF _Toc209624241 \h </w:instrText>
+        </w:r>
+        <w:r>
+          <w:rPr>
+            <w:noProof/>
+            <w:webHidden/>
+            <w:sz w:val="22"/>
+            <w:szCs w:val="22"/>
+          </w:rPr>
+        </w:r>
+        <w:r>
+          <w:rPr>
+            <w:noProof/>
+            <w:webHidden/>
+            <w:sz w:val="22"/>
+            <w:szCs w:val="22"/>
           </w:rPr>
           <w:fldChar w:fldCharType="separate"/>
         </w:r>
@@ -3786,13 +4378,17 @@
           <w:rPr>
             <w:noProof/>
             <w:webHidden/>
-          </w:rPr>
-          <w:t>12</w:t>
-        </w:r>
-        <w:r>
-          <w:rPr>
-            <w:noProof/>
-            <w:webHidden/>
+            <w:sz w:val="22"/>
+            <w:szCs w:val="22"/>
+          </w:rPr>
+          <w:t>13</w:t>
+        </w:r>
+        <w:r>
+          <w:rPr>
+            <w:noProof/>
+            <w:webHidden/>
+            <w:sz w:val="22"/>
+            <w:szCs w:val="22"/>
           </w:rPr>
           <w:fldChar w:fldCharType="end"/>
         </w:r>
@@ -3805,18 +4401,20 @@
           <w:tab w:val="right" w:leader="underscore" w:pos="9016"/>
         </w:tabs>
         <w:rPr>
-          <w:rFonts w:eastAsiaTheme="minorEastAsia"/>
+          <w:rFonts w:asciiTheme="minorHAnsi" w:eastAsiaTheme="minorEastAsia" w:hAnsiTheme="minorHAnsi"/>
           <w:noProof/>
-          <w:sz w:val="24"/>
-          <w:szCs w:val="24"/>
+          <w:sz w:val="28"/>
+          <w:szCs w:val="28"/>
           <w:lang w:val="en-CH" w:eastAsia="en-CH"/>
         </w:rPr>
       </w:pPr>
-      <w:hyperlink w:anchor="_Toc209175234" w:history="1">
+      <w:hyperlink w:anchor="_Toc209624242" w:history="1">
         <w:r>
           <w:rPr>
             <w:rStyle w:val="Hyperlink"/>
             <w:noProof/>
+            <w:sz w:val="22"/>
+            <w:szCs w:val="22"/>
           </w:rPr>
           <w:t>Der eingefügte Text ist in der falschen Sprache.</w:t>
         </w:r>
@@ -3824,6 +4422,8 @@
           <w:rPr>
             <w:noProof/>
             <w:webHidden/>
+            <w:sz w:val="22"/>
+            <w:szCs w:val="22"/>
           </w:rPr>
           <w:tab/>
         </w:r>
@@ -3831,6 +4431,8 @@
           <w:rPr>
             <w:noProof/>
             <w:webHidden/>
+            <w:sz w:val="22"/>
+            <w:szCs w:val="22"/>
           </w:rPr>
           <w:fldChar w:fldCharType="begin"/>
         </w:r>
@@ -3838,19 +4440,25 @@
           <w:rPr>
             <w:noProof/>
             <w:webHidden/>
-          </w:rPr>
-          <w:instrText xml:space="preserve"> PAGEREF _Toc209175234 \h </w:instrText>
-        </w:r>
-        <w:r>
-          <w:rPr>
-            <w:noProof/>
-            <w:webHidden/>
-          </w:rPr>
-        </w:r>
-        <w:r>
-          <w:rPr>
-            <w:noProof/>
-            <w:webHidden/>
+            <w:sz w:val="22"/>
+            <w:szCs w:val="22"/>
+          </w:rPr>
+          <w:instrText xml:space="preserve"> PAGEREF _Toc209624242 \h </w:instrText>
+        </w:r>
+        <w:r>
+          <w:rPr>
+            <w:noProof/>
+            <w:webHidden/>
+            <w:sz w:val="22"/>
+            <w:szCs w:val="22"/>
+          </w:rPr>
+        </w:r>
+        <w:r>
+          <w:rPr>
+            <w:noProof/>
+            <w:webHidden/>
+            <w:sz w:val="22"/>
+            <w:szCs w:val="22"/>
           </w:rPr>
           <w:fldChar w:fldCharType="separate"/>
         </w:r>
@@ -3858,13 +4466,17 @@
           <w:rPr>
             <w:noProof/>
             <w:webHidden/>
-          </w:rPr>
-          <w:t>12</w:t>
-        </w:r>
-        <w:r>
-          <w:rPr>
-            <w:noProof/>
-            <w:webHidden/>
+            <w:sz w:val="22"/>
+            <w:szCs w:val="22"/>
+          </w:rPr>
+          <w:t>13</w:t>
+        </w:r>
+        <w:r>
+          <w:rPr>
+            <w:noProof/>
+            <w:webHidden/>
+            <w:sz w:val="22"/>
+            <w:szCs w:val="22"/>
           </w:rPr>
           <w:fldChar w:fldCharType="end"/>
         </w:r>
@@ -3877,18 +4489,20 @@
           <w:tab w:val="right" w:leader="underscore" w:pos="9016"/>
         </w:tabs>
         <w:rPr>
-          <w:rFonts w:eastAsiaTheme="minorEastAsia"/>
+          <w:rFonts w:asciiTheme="minorHAnsi" w:eastAsiaTheme="minorEastAsia" w:hAnsiTheme="minorHAnsi"/>
           <w:noProof/>
-          <w:sz w:val="24"/>
-          <w:szCs w:val="24"/>
+          <w:sz w:val="28"/>
+          <w:szCs w:val="28"/>
           <w:lang w:val="en-CH" w:eastAsia="en-CH"/>
         </w:rPr>
       </w:pPr>
-      <w:hyperlink w:anchor="_Toc209175235" w:history="1">
+      <w:hyperlink w:anchor="_Toc209624243" w:history="1">
         <w:r>
           <w:rPr>
             <w:rStyle w:val="Hyperlink"/>
             <w:noProof/>
+            <w:sz w:val="22"/>
+            <w:szCs w:val="22"/>
           </w:rPr>
           <w:t>Es werden nur Interjektionen, Satzzeichen und Kauderwelsch eingefügt.</w:t>
         </w:r>
@@ -3896,6 +4510,8 @@
           <w:rPr>
             <w:noProof/>
             <w:webHidden/>
+            <w:sz w:val="22"/>
+            <w:szCs w:val="22"/>
           </w:rPr>
           <w:tab/>
         </w:r>
@@ -3903,6 +4519,8 @@
           <w:rPr>
             <w:noProof/>
             <w:webHidden/>
+            <w:sz w:val="22"/>
+            <w:szCs w:val="22"/>
           </w:rPr>
           <w:fldChar w:fldCharType="begin"/>
         </w:r>
@@ -3910,19 +4528,25 @@
           <w:rPr>
             <w:noProof/>
             <w:webHidden/>
-          </w:rPr>
-          <w:instrText xml:space="preserve"> PAGEREF _Toc209175235 \h </w:instrText>
-        </w:r>
-        <w:r>
-          <w:rPr>
-            <w:noProof/>
-            <w:webHidden/>
-          </w:rPr>
-        </w:r>
-        <w:r>
-          <w:rPr>
-            <w:noProof/>
-            <w:webHidden/>
+            <w:sz w:val="22"/>
+            <w:szCs w:val="22"/>
+          </w:rPr>
+          <w:instrText xml:space="preserve"> PAGEREF _Toc209624243 \h </w:instrText>
+        </w:r>
+        <w:r>
+          <w:rPr>
+            <w:noProof/>
+            <w:webHidden/>
+            <w:sz w:val="22"/>
+            <w:szCs w:val="22"/>
+          </w:rPr>
+        </w:r>
+        <w:r>
+          <w:rPr>
+            <w:noProof/>
+            <w:webHidden/>
+            <w:sz w:val="22"/>
+            <w:szCs w:val="22"/>
           </w:rPr>
           <w:fldChar w:fldCharType="separate"/>
         </w:r>
@@ -3930,6 +4554,8 @@
           <w:rPr>
             <w:noProof/>
             <w:webHidden/>
+            <w:sz w:val="22"/>
+            <w:szCs w:val="22"/>
           </w:rPr>
           <w:t>13</w:t>
         </w:r>
@@ -3937,6 +4563,8 @@
           <w:rPr>
             <w:noProof/>
             <w:webHidden/>
+            <w:sz w:val="22"/>
+            <w:szCs w:val="22"/>
           </w:rPr>
           <w:fldChar w:fldCharType="end"/>
         </w:r>
@@ -3949,18 +4577,20 @@
           <w:tab w:val="right" w:leader="underscore" w:pos="9016"/>
         </w:tabs>
         <w:rPr>
-          <w:rFonts w:eastAsiaTheme="minorEastAsia"/>
+          <w:rFonts w:asciiTheme="minorHAnsi" w:eastAsiaTheme="minorEastAsia" w:hAnsiTheme="minorHAnsi"/>
           <w:noProof/>
-          <w:sz w:val="24"/>
-          <w:szCs w:val="24"/>
+          <w:sz w:val="28"/>
+          <w:szCs w:val="28"/>
           <w:lang w:val="en-CH" w:eastAsia="en-CH"/>
         </w:rPr>
       </w:pPr>
-      <w:hyperlink w:anchor="_Toc209175236" w:history="1">
+      <w:hyperlink w:anchor="_Toc209624244" w:history="1">
         <w:r>
           <w:rPr>
             <w:rStyle w:val="Hyperlink"/>
             <w:noProof/>
+            <w:sz w:val="22"/>
+            <w:szCs w:val="22"/>
           </w:rPr>
           <w:t>Jeweils am Anfang oder Ende eines eingefügten Textblocks ist die Transkription fehlerhaft</w:t>
         </w:r>
@@ -3968,6 +4598,8 @@
           <w:rPr>
             <w:noProof/>
             <w:webHidden/>
+            <w:sz w:val="22"/>
+            <w:szCs w:val="22"/>
           </w:rPr>
           <w:tab/>
         </w:r>
@@ -3975,6 +4607,8 @@
           <w:rPr>
             <w:noProof/>
             <w:webHidden/>
+            <w:sz w:val="22"/>
+            <w:szCs w:val="22"/>
           </w:rPr>
           <w:fldChar w:fldCharType="begin"/>
         </w:r>
@@ -3982,19 +4616,25 @@
           <w:rPr>
             <w:noProof/>
             <w:webHidden/>
-          </w:rPr>
-          <w:instrText xml:space="preserve"> PAGEREF _Toc209175236 \h </w:instrText>
-        </w:r>
-        <w:r>
-          <w:rPr>
-            <w:noProof/>
-            <w:webHidden/>
-          </w:rPr>
-        </w:r>
-        <w:r>
-          <w:rPr>
-            <w:noProof/>
-            <w:webHidden/>
+            <w:sz w:val="22"/>
+            <w:szCs w:val="22"/>
+          </w:rPr>
+          <w:instrText xml:space="preserve"> PAGEREF _Toc209624244 \h </w:instrText>
+        </w:r>
+        <w:r>
+          <w:rPr>
+            <w:noProof/>
+            <w:webHidden/>
+            <w:sz w:val="22"/>
+            <w:szCs w:val="22"/>
+          </w:rPr>
+        </w:r>
+        <w:r>
+          <w:rPr>
+            <w:noProof/>
+            <w:webHidden/>
+            <w:sz w:val="22"/>
+            <w:szCs w:val="22"/>
           </w:rPr>
           <w:fldChar w:fldCharType="separate"/>
         </w:r>
@@ -4002,6 +4642,8 @@
           <w:rPr>
             <w:noProof/>
             <w:webHidden/>
+            <w:sz w:val="22"/>
+            <w:szCs w:val="22"/>
           </w:rPr>
           <w:t>13</w:t>
         </w:r>
@@ -4009,6 +4651,8 @@
           <w:rPr>
             <w:noProof/>
             <w:webHidden/>
+            <w:sz w:val="22"/>
+            <w:szCs w:val="22"/>
           </w:rPr>
           <w:fldChar w:fldCharType="end"/>
         </w:r>
@@ -4022,53 +4666,61 @@
           <w:tab w:val="right" w:leader="underscore" w:pos="9016"/>
         </w:tabs>
         <w:rPr>
-          <w:rFonts w:eastAsiaTheme="minorEastAsia"/>
+          <w:rFonts w:asciiTheme="minorHAnsi" w:eastAsiaTheme="minorEastAsia" w:hAnsiTheme="minorHAnsi"/>
           <w:b w:val="0"/>
           <w:bCs w:val="0"/>
           <w:noProof/>
-          <w:sz w:val="24"/>
-          <w:szCs w:val="24"/>
+          <w:sz w:val="28"/>
+          <w:szCs w:val="28"/>
           <w:lang w:val="en-CH" w:eastAsia="en-CH"/>
         </w:rPr>
       </w:pPr>
-      <w:hyperlink w:anchor="_Toc209175237" w:history="1">
+      <w:hyperlink w:anchor="_Toc209624245" w:history="1">
         <w:r>
           <w:rPr>
             <w:rStyle w:val="Hyperlink"/>
             <w:noProof/>
+            <w:sz w:val="24"/>
+            <w:szCs w:val="24"/>
           </w:rPr>
           <w:t>8.</w:t>
         </w:r>
         <w:r>
           <w:rPr>
-            <w:rFonts w:eastAsiaTheme="minorEastAsia"/>
+            <w:rFonts w:asciiTheme="minorHAnsi" w:eastAsiaTheme="minorEastAsia" w:hAnsiTheme="minorHAnsi"/>
             <w:b w:val="0"/>
             <w:bCs w:val="0"/>
             <w:noProof/>
+            <w:sz w:val="28"/>
+            <w:szCs w:val="28"/>
+            <w:lang w:val="en-CH" w:eastAsia="en-CH"/>
+          </w:rPr>
+          <w:tab/>
+        </w:r>
+        <w:r>
+          <w:rPr>
+            <w:rStyle w:val="Hyperlink"/>
+            <w:noProof/>
             <w:sz w:val="24"/>
             <w:szCs w:val="24"/>
-            <w:lang w:val="en-CH" w:eastAsia="en-CH"/>
+          </w:rPr>
+          <w:t>Impressum</w:t>
+        </w:r>
+        <w:r>
+          <w:rPr>
+            <w:noProof/>
+            <w:webHidden/>
+            <w:sz w:val="24"/>
+            <w:szCs w:val="24"/>
           </w:rPr>
           <w:tab/>
         </w:r>
         <w:r>
           <w:rPr>
-            <w:rStyle w:val="Hyperlink"/>
-            <w:noProof/>
-          </w:rPr>
-          <w:t>Impressum</w:t>
-        </w:r>
-        <w:r>
-          <w:rPr>
-            <w:noProof/>
-            <w:webHidden/>
-          </w:rPr>
-          <w:tab/>
-        </w:r>
-        <w:r>
-          <w:rPr>
-            <w:noProof/>
-            <w:webHidden/>
+            <w:noProof/>
+            <w:webHidden/>
+            <w:sz w:val="24"/>
+            <w:szCs w:val="24"/>
           </w:rPr>
           <w:fldChar w:fldCharType="begin"/>
         </w:r>
@@ -4076,19 +4728,25 @@
           <w:rPr>
             <w:noProof/>
             <w:webHidden/>
-          </w:rPr>
-          <w:instrText xml:space="preserve"> PAGEREF _Toc209175237 \h </w:instrText>
-        </w:r>
-        <w:r>
-          <w:rPr>
-            <w:noProof/>
-            <w:webHidden/>
-          </w:rPr>
-        </w:r>
-        <w:r>
-          <w:rPr>
-            <w:noProof/>
-            <w:webHidden/>
+            <w:sz w:val="24"/>
+            <w:szCs w:val="24"/>
+          </w:rPr>
+          <w:instrText xml:space="preserve"> PAGEREF _Toc209624245 \h </w:instrText>
+        </w:r>
+        <w:r>
+          <w:rPr>
+            <w:noProof/>
+            <w:webHidden/>
+            <w:sz w:val="24"/>
+            <w:szCs w:val="24"/>
+          </w:rPr>
+        </w:r>
+        <w:r>
+          <w:rPr>
+            <w:noProof/>
+            <w:webHidden/>
+            <w:sz w:val="24"/>
+            <w:szCs w:val="24"/>
           </w:rPr>
           <w:fldChar w:fldCharType="separate"/>
         </w:r>
@@ -4096,6 +4754,8 @@
           <w:rPr>
             <w:noProof/>
             <w:webHidden/>
+            <w:sz w:val="24"/>
+            <w:szCs w:val="24"/>
           </w:rPr>
           <w:t>14</w:t>
         </w:r>
@@ -4103,6 +4763,8 @@
           <w:rPr>
             <w:noProof/>
             <w:webHidden/>
+            <w:sz w:val="24"/>
+            <w:szCs w:val="24"/>
           </w:rPr>
           <w:fldChar w:fldCharType="end"/>
         </w:r>
@@ -4117,11 +4779,17 @@
       </w:pPr>
       <w:r>
         <w:rPr>
+          <w:sz w:val="40"/>
+          <w:szCs w:val="40"/>
           <w:lang w:val="de-CH"/>
         </w:rPr>
         <w:fldChar w:fldCharType="end"/>
       </w:r>
       <w:r>
+        <w:rPr>
+          <w:sz w:val="36"/>
+          <w:szCs w:val="36"/>
+        </w:rPr>
         <w:br w:type="page"/>
       </w:r>
     </w:p>
@@ -4132,7 +4800,7 @@
           <w:lang w:val="de-CH"/>
         </w:rPr>
       </w:pPr>
-      <w:bookmarkStart w:id="0" w:name="_Toc209175198"/>
+      <w:bookmarkStart w:id="0" w:name="_Toc209624206"/>
       <w:r>
         <w:rPr>
           <w:lang w:val="de-CH"/>
@@ -4217,7 +4885,7 @@
       <w:pPr>
         <w:pStyle w:val="Heading2"/>
       </w:pPr>
-      <w:bookmarkStart w:id="2" w:name="_Toc209175199"/>
+      <w:bookmarkStart w:id="2" w:name="_Toc209624207"/>
       <w:r>
         <w:t>Wichtigste Merkmale:</w:t>
       </w:r>
@@ -4327,7 +4995,7 @@
       <w:pPr>
         <w:pStyle w:val="Heading2"/>
       </w:pPr>
-      <w:bookmarkStart w:id="3" w:name="_Toc209175200"/>
+      <w:bookmarkStart w:id="3" w:name="_Toc209624208"/>
       <w:r>
         <w:t>Voraussetzungen</w:t>
       </w:r>
@@ -4337,7 +5005,7 @@
       <w:pPr>
         <w:pStyle w:val="Heading2"/>
       </w:pPr>
-      <w:bookmarkStart w:id="4" w:name="_Toc209175201"/>
+      <w:bookmarkStart w:id="4" w:name="_Toc209624209"/>
       <w:r>
         <w:t xml:space="preserve">Minimale </w:t>
       </w:r>
@@ -4502,7 +5170,7 @@
       <w:pPr>
         <w:pStyle w:val="Heading2"/>
       </w:pPr>
-      <w:bookmarkStart w:id="5" w:name="_Toc209175202"/>
+      <w:bookmarkStart w:id="5" w:name="_Toc209624210"/>
       <w:r>
         <w:t>Empfohlene Systemanforderungen</w:t>
       </w:r>
@@ -4686,7 +5354,7 @@
           <w:lang w:val="de-CH"/>
         </w:rPr>
       </w:pPr>
-      <w:bookmarkStart w:id="6" w:name="_Toc209175203"/>
+      <w:bookmarkStart w:id="6" w:name="_Toc209624211"/>
       <w:r>
         <w:rPr>
           <w:lang w:val="de-CH"/>
@@ -4818,7 +5486,7 @@
           <w:lang w:val="de-CH"/>
         </w:rPr>
       </w:pPr>
-      <w:bookmarkStart w:id="7" w:name="_Toc209175204"/>
+      <w:bookmarkStart w:id="7" w:name="_Toc209624212"/>
       <w:r>
         <w:rPr>
           <w:lang w:val="de-CH"/>
@@ -4832,7 +5500,7 @@
       <w:pPr>
         <w:pStyle w:val="Heading2"/>
       </w:pPr>
-      <w:bookmarkStart w:id="8" w:name="_Toc209175205"/>
+      <w:bookmarkStart w:id="8" w:name="_Toc209624213"/>
       <w:r>
         <w:t>Schritt für Schritt</w:t>
       </w:r>
@@ -5287,7 +5955,7 @@
           <w:lang w:val="de-CH"/>
         </w:rPr>
       </w:pPr>
-      <w:bookmarkStart w:id="9" w:name="_Toc209175206"/>
+      <w:bookmarkStart w:id="9" w:name="_Toc209624214"/>
       <w:r>
         <w:rPr>
           <w:lang w:val="de-CH"/>
@@ -5313,7 +5981,7 @@
       <w:pPr>
         <w:pStyle w:val="Heading2"/>
       </w:pPr>
-      <w:bookmarkStart w:id="10" w:name="_Toc209175207"/>
+      <w:bookmarkStart w:id="10" w:name="_Toc209624215"/>
       <w:r>
         <w:t>Erster Start</w:t>
       </w:r>
@@ -5393,7 +6061,7 @@
       <w:pPr>
         <w:pStyle w:val="Heading2"/>
       </w:pPr>
-      <w:bookmarkStart w:id="11" w:name="_Toc209175208"/>
+      <w:bookmarkStart w:id="11" w:name="_Toc209624216"/>
       <w:r>
         <w:t>Einfache Transkription</w:t>
       </w:r>
@@ -5609,7 +6277,7 @@
           <w:lang w:val="de-CH"/>
         </w:rPr>
       </w:pPr>
-      <w:bookmarkStart w:id="12" w:name="_Toc209175209"/>
+      <w:bookmarkStart w:id="12" w:name="_Toc209624217"/>
       <w:r>
         <w:rPr>
           <w:lang w:val="de-CH"/>
@@ -5623,7 +6291,7 @@
       <w:pPr>
         <w:pStyle w:val="Heading2"/>
       </w:pPr>
-      <w:bookmarkStart w:id="13" w:name="_Toc209175210"/>
+      <w:bookmarkStart w:id="13" w:name="_Toc209624218"/>
       <w:r>
         <w:t>Steuerelemente</w:t>
       </w:r>
@@ -5717,7 +6385,7 @@
       <w:pPr>
         <w:pStyle w:val="Heading3"/>
       </w:pPr>
-      <w:bookmarkStart w:id="14" w:name="_Toc209175211"/>
+      <w:bookmarkStart w:id="14" w:name="_Toc209624219"/>
       <w:r>
         <w:t>Zuhören Starten/Beenden</w:t>
       </w:r>
@@ -5892,7 +6560,7 @@
       <w:pPr>
         <w:pStyle w:val="Heading3"/>
       </w:pPr>
-      <w:bookmarkStart w:id="15" w:name="_Toc209175212"/>
+      <w:bookmarkStart w:id="15" w:name="_Toc209624220"/>
       <w:r>
         <w:t xml:space="preserve">Diktat </w:t>
       </w:r>
@@ -6069,7 +6737,7 @@
       <w:pPr>
         <w:pStyle w:val="Heading3"/>
       </w:pPr>
-      <w:bookmarkStart w:id="16" w:name="_Toc209175213"/>
+      <w:bookmarkStart w:id="16" w:name="_Toc209624221"/>
       <w:r>
         <w:lastRenderedPageBreak/>
         <w:t>Mikrofonauswahl</w:t>
@@ -6218,7 +6886,7 @@
       <w:pPr>
         <w:pStyle w:val="Heading3"/>
       </w:pPr>
-      <w:bookmarkStart w:id="17" w:name="_Toc209175214"/>
+      <w:bookmarkStart w:id="17" w:name="_Toc209624222"/>
       <w:r>
         <w:t>Modelauswahl</w:t>
       </w:r>
@@ -6566,7 +7234,7 @@
       <w:pPr>
         <w:pStyle w:val="Heading3"/>
       </w:pPr>
-      <w:bookmarkStart w:id="18" w:name="_Toc209175215"/>
+      <w:bookmarkStart w:id="18" w:name="_Toc209624223"/>
       <w:r>
         <w:t>Sprachauswahl</w:t>
       </w:r>
@@ -6758,7 +7426,7 @@
       <w:pPr>
         <w:pStyle w:val="Heading3"/>
       </w:pPr>
-      <w:bookmarkStart w:id="19" w:name="_Toc209175216"/>
+      <w:bookmarkStart w:id="19" w:name="_Toc209624224"/>
       <w:r>
         <w:lastRenderedPageBreak/>
         <w:t>Modeleinstellungen</w:t>
@@ -6914,7 +7582,7 @@
       <w:pPr>
         <w:pStyle w:val="Heading3"/>
       </w:pPr>
-      <w:bookmarkStart w:id="20" w:name="_Toc209175217"/>
+      <w:bookmarkStart w:id="20" w:name="_Toc209624225"/>
       <w:proofErr w:type="spellStart"/>
       <w:r>
         <w:t>Reset</w:t>
@@ -7140,7 +7808,7 @@
           <w:lang w:val="de-CH"/>
         </w:rPr>
       </w:pPr>
-      <w:bookmarkStart w:id="21" w:name="_Toc209175218"/>
+      <w:bookmarkStart w:id="21" w:name="_Toc209624226"/>
       <w:r>
         <w:rPr>
           <w:lang w:val="de-CH"/>
@@ -7154,7 +7822,7 @@
       <w:pPr>
         <w:pStyle w:val="Heading2"/>
       </w:pPr>
-      <w:bookmarkStart w:id="22" w:name="_Toc209175219"/>
+      <w:bookmarkStart w:id="22" w:name="_Toc209624227"/>
       <w:r>
         <w:t>Sprachbefehle im Zuhörer Modus</w:t>
       </w:r>
@@ -7290,7 +7958,7 @@
       <w:pPr>
         <w:pStyle w:val="Heading2"/>
       </w:pPr>
-      <w:bookmarkStart w:id="23" w:name="_Toc209175220"/>
+      <w:bookmarkStart w:id="23" w:name="_Toc209624228"/>
       <w:r>
         <w:t>Sprachbefehle im Diktatmodus</w:t>
       </w:r>
@@ -7319,7 +7987,7 @@
       <w:pPr>
         <w:pStyle w:val="Heading3"/>
       </w:pPr>
-      <w:bookmarkStart w:id="24" w:name="_Toc209175221"/>
+      <w:bookmarkStart w:id="24" w:name="_Toc209624229"/>
       <w:r>
         <w:t>Standartbefehle</w:t>
       </w:r>
@@ -7545,7 +8213,7 @@
       <w:pPr>
         <w:pStyle w:val="Heading3"/>
       </w:pPr>
-      <w:bookmarkStart w:id="25" w:name="_Toc209175222"/>
+      <w:bookmarkStart w:id="25" w:name="_Toc209624230"/>
       <w:r>
         <w:t>Benutzerdefinierte Befehle</w:t>
       </w:r>
@@ -7595,7 +8263,7 @@
       <w:pPr>
         <w:pStyle w:val="Heading2"/>
       </w:pPr>
-      <w:bookmarkStart w:id="26" w:name="_Toc209175223"/>
+      <w:bookmarkStart w:id="26" w:name="_Toc209624231"/>
       <w:r>
         <w:t>Bearbeiten von Sprachbefehlen.</w:t>
       </w:r>
@@ -7643,7 +8311,7 @@
       <w:pPr>
         <w:pStyle w:val="Heading3"/>
       </w:pPr>
-      <w:bookmarkStart w:id="27" w:name="_Toc209175224"/>
+      <w:bookmarkStart w:id="27" w:name="_Toc209624232"/>
       <w:r>
         <w:t xml:space="preserve">Wo finde </w:t>
       </w:r>
@@ -7763,7 +8431,7 @@
       <w:pPr>
         <w:pStyle w:val="Heading3"/>
       </w:pPr>
-      <w:bookmarkStart w:id="28" w:name="_Toc209175225"/>
+      <w:bookmarkStart w:id="28" w:name="_Toc209624233"/>
       <w:r>
         <w:t>Wie ist die Datei aufgebaut?</w:t>
       </w:r>
@@ -7773,7 +8441,6 @@
       <w:pPr>
         <w:rPr>
           <w:rFonts w:cs="Times New Roman"/>
-          <w:color w:val="196B24" w:themeColor="accent3"/>
         </w:rPr>
       </w:pPr>
       <w:r>
@@ -7892,6 +8559,15 @@
         </w:rPr>
         <w:t>:</w:t>
       </w:r>
+    </w:p>
+    <w:p>
+      <w:pPr>
+        <w:ind w:left="720"/>
+        <w:rPr>
+          <w:rFonts w:cs="Times New Roman"/>
+          <w:color w:val="196B24" w:themeColor="accent3"/>
+        </w:rPr>
+      </w:pPr>
       <w:r>
         <w:rPr>
           <w:rFonts w:cs="Times New Roman"/>
@@ -8432,6 +9108,7 @@
         <w:ind w:left="720"/>
         <w:rPr>
           <w:rFonts w:cs="Times New Roman"/>
+          <w:color w:val="196B24" w:themeColor="accent3"/>
         </w:rPr>
       </w:pPr>
       <w:r>
@@ -8466,9 +9143,18 @@
     </w:p>
     <w:p>
       <w:pPr>
+        <w:spacing w:line="240" w:lineRule="auto"/>
+        <w:ind w:left="720"/>
+        <w:rPr>
+          <w:rFonts w:cs="Times New Roman"/>
+        </w:rPr>
+      </w:pPr>
+    </w:p>
+    <w:p>
+      <w:pPr>
         <w:pStyle w:val="Heading3"/>
       </w:pPr>
-      <w:bookmarkStart w:id="30" w:name="_Toc209175226"/>
+      <w:bookmarkStart w:id="30" w:name="_Toc209624234"/>
       <w:r>
         <w:t>Wie kann ich die Datei bearbeiten?</w:t>
       </w:r>
@@ -8791,10 +9477,19 @@
     </w:p>
     <w:p>
       <w:pPr>
+        <w:rPr>
+          <w:rFonts w:cs="Times New Roman"/>
+          <w:color w:val="000000" w:themeColor="text1"/>
+        </w:rPr>
+      </w:pPr>
+    </w:p>
+    <w:p>
+      <w:pPr>
         <w:pStyle w:val="Heading3"/>
       </w:pPr>
-      <w:bookmarkStart w:id="31" w:name="_Toc209175227"/>
-      <w:r>
+      <w:bookmarkStart w:id="31" w:name="_Toc209624235"/>
+      <w:r>
+        <w:lastRenderedPageBreak/>
         <w:t>Einschränkungen:</w:t>
       </w:r>
       <w:bookmarkEnd w:id="31"/>
@@ -8854,12 +9549,11 @@
           <w:lang w:val="de-CH"/>
         </w:rPr>
       </w:pPr>
-      <w:bookmarkStart w:id="32" w:name="_Toc209175228"/>
+      <w:bookmarkStart w:id="32" w:name="_Toc209624236"/>
       <w:r>
         <w:rPr>
           <w:lang w:val="de-CH"/>
         </w:rPr>
-        <w:lastRenderedPageBreak/>
         <w:t>Troubleshooting</w:t>
       </w:r>
       <w:bookmarkEnd w:id="32"/>
@@ -8868,7 +9562,7 @@
       <w:pPr>
         <w:pStyle w:val="Heading2"/>
       </w:pPr>
-      <w:bookmarkStart w:id="33" w:name="_Toc209175229"/>
+      <w:bookmarkStart w:id="33" w:name="_Toc209624237"/>
       <w:r>
         <w:t xml:space="preserve">Ich kann die </w:t>
       </w:r>
@@ -9093,7 +9787,7 @@
       <w:pPr>
         <w:pStyle w:val="Heading2"/>
       </w:pPr>
-      <w:bookmarkStart w:id="34" w:name="_Toc209175230"/>
+      <w:bookmarkStart w:id="34" w:name="_Toc209624238"/>
       <w:r>
         <w:t>Nach dem Starten der Transkription, stürzt Word a</w:t>
       </w:r>
@@ -9109,7 +9803,7 @@
       <w:pPr>
         <w:pStyle w:val="Heading3"/>
       </w:pPr>
-      <w:bookmarkStart w:id="35" w:name="_Toc209175231"/>
+      <w:bookmarkStart w:id="35" w:name="_Toc209624239"/>
       <w:r>
         <w:t>Word stürzt ab, kaum wurde auf den Diktat Knopf gedrückt.</w:t>
       </w:r>
@@ -9182,27 +9876,18 @@
     <w:p>
       <w:pPr>
         <w:pStyle w:val="Heading3"/>
-        <w:rPr>
-          <w:b w:val="0"/>
-        </w:rPr>
-      </w:pPr>
-      <w:bookmarkStart w:id="36" w:name="_Toc209175232"/>
-      <w:r>
-        <w:rPr>
-          <w:b w:val="0"/>
-        </w:rPr>
-        <w:t xml:space="preserve">Es dauert eine Weile, und der Computer fährt zu Höchstleistungen </w:t>
-      </w:r>
-      <w:r>
-        <w:rPr>
-          <w:b w:val="0"/>
-        </w:rPr>
-        <w:t>auf,</w:t>
-      </w:r>
-      <w:r>
-        <w:rPr>
-          <w:b w:val="0"/>
-        </w:rPr>
+      </w:pPr>
+      <w:bookmarkStart w:id="36" w:name="_Toc209624240"/>
+      <w:r>
+        <w:t xml:space="preserve">Es dauert eine Weile, und der Computer </w:t>
+      </w:r>
+      <w:r>
+        <w:t>ist ausgelastet</w:t>
+      </w:r>
+      <w:r>
+        <w:t>,</w:t>
+      </w:r>
+      <w:r>
         <w:t xml:space="preserve"> bevor Word abstürzt.</w:t>
       </w:r>
       <w:bookmarkEnd w:id="36"/>
@@ -9350,8 +10035,9 @@
       <w:pPr>
         <w:pStyle w:val="Heading2"/>
       </w:pPr>
-      <w:bookmarkStart w:id="37" w:name="_Toc209175233"/>
-      <w:r>
+      <w:bookmarkStart w:id="37" w:name="_Toc209624241"/>
+      <w:r>
+        <w:lastRenderedPageBreak/>
         <w:t>Die Transkription ist fehlerhaft</w:t>
       </w:r>
       <w:bookmarkEnd w:id="37"/>
@@ -9360,7 +10046,7 @@
       <w:pPr>
         <w:pStyle w:val="Heading3"/>
       </w:pPr>
-      <w:bookmarkStart w:id="38" w:name="_Toc209175234"/>
+      <w:bookmarkStart w:id="38" w:name="_Toc209624242"/>
       <w:r>
         <w:t>Der eingefügte Text ist in der falschen Sprache.</w:t>
       </w:r>
@@ -9459,7 +10145,6 @@
         <w:rPr>
           <w:rFonts w:cs="Times New Roman"/>
         </w:rPr>
-        <w:lastRenderedPageBreak/>
         <w:t xml:space="preserve">Werden russisch, französische oder sonstige Sprachen eingefügt, ist höchstwahrscheinlich der Umgebungslärm zu hoch, </w:t>
       </w:r>
       <w:r>
@@ -9475,7 +10160,7 @@
       <w:pPr>
         <w:pStyle w:val="Heading3"/>
       </w:pPr>
-      <w:bookmarkStart w:id="39" w:name="_Toc209175235"/>
+      <w:bookmarkStart w:id="39" w:name="_Toc209624243"/>
       <w:r>
         <w:t>Es werden nur Interjektionen, Satzzeichen und Kauderwelsch eingefügt.</w:t>
       </w:r>
@@ -9666,7 +10351,7 @@
       <w:pPr>
         <w:pStyle w:val="Heading3"/>
       </w:pPr>
-      <w:bookmarkStart w:id="40" w:name="_Toc209175236"/>
+      <w:bookmarkStart w:id="40" w:name="_Toc209624244"/>
       <w:r>
         <w:t>Jeweils am Anfang oder Ende eines eingefügten Textblocks ist die Transkription</w:t>
       </w:r>
@@ -9725,7 +10410,7 @@
           <w:lang w:val="de-CH"/>
         </w:rPr>
       </w:pPr>
-      <w:bookmarkStart w:id="41" w:name="_Toc209175237"/>
+      <w:bookmarkStart w:id="41" w:name="_Toc209624245"/>
       <w:r>
         <w:rPr>
           <w:lang w:val="de-CH"/>
@@ -9962,7 +10647,7 @@
           <w:noProof/>
         </w:rPr>
         <w:drawing>
-          <wp:anchor distT="0" distB="0" distL="114300" distR="114300" simplePos="0" relativeHeight="251663360" behindDoc="0" locked="0" layoutInCell="1" allowOverlap="1" wp14:anchorId="578ACBEC" wp14:editId="21AEB1E3">
+          <wp:anchor distT="0" distB="0" distL="114300" distR="114300" simplePos="0" relativeHeight="251663360" behindDoc="0" locked="0" layoutInCell="1" allowOverlap="1" wp14:anchorId="578ACBEC" wp14:editId="11474B93">
             <wp:simplePos x="0" y="0"/>
             <wp:positionH relativeFrom="column">
               <wp:posOffset>2127115</wp:posOffset>
@@ -14556,7 +15241,7 @@
     <w:uiPriority w:val="9"/>
     <w:unhideWhenUsed/>
     <w:qFormat/>
-    <w:rsid w:val="00073B0B"/>
+    <w:rsid w:val="00DD4786"/>
     <w:pPr>
       <w:keepNext/>
       <w:keepLines/>
@@ -14769,7 +15454,7 @@
     <w:basedOn w:val="DefaultParagraphFont"/>
     <w:link w:val="Heading3"/>
     <w:uiPriority w:val="9"/>
-    <w:rsid w:val="00073B0B"/>
+    <w:rsid w:val="00DD4786"/>
     <w:rPr>
       <w:rFonts w:ascii="Times New Roman" w:eastAsiaTheme="majorEastAsia" w:hAnsi="Times New Roman" w:cs="Times New Roman"/>
       <w:b/>

</xml_diff>